<commit_message>
Deploying to gh-pages from @ shuvom-s/shuvom-s.github.io@3773da3c1b6339f3d4c229536a587ca913d8a6b1 🚀
</commit_message>
<xml_diff>
--- a/assets/pdf/cv_apr26.docx
+++ b/assets/pdf/cv_apr26.docx
@@ -1,6 +1,6 @@
 
 <file path=word/document.xml><?xml version="1.0" encoding="utf-8"?>
-<w:document xmlns:wpc="http://schemas.microsoft.com/office/word/2010/wordprocessingCanvas" xmlns:cx="http://schemas.microsoft.com/office/drawing/2014/chartex" xmlns:cx1="http://schemas.microsoft.com/office/drawing/2015/9/8/chartex" xmlns:cx2="http://schemas.microsoft.com/office/drawing/2015/10/21/chartex" xmlns:cx3="http://schemas.microsoft.com/office/drawing/2016/5/9/chartex" xmlns:cx4="http://schemas.microsoft.com/office/drawing/2016/5/10/chartex" xmlns:cx5="http://schemas.microsoft.com/office/drawing/2016/5/11/chartex" xmlns:cx6="http://schemas.microsoft.com/office/drawing/2016/5/12/chartex" xmlns:cx7="http://schemas.microsoft.com/office/drawing/2016/5/13/chartex" xmlns:cx8="http://schemas.microsoft.com/office/drawing/2016/5/14/chartex" xmlns:mc="http://schemas.openxmlformats.org/markup-compatibility/2006" xmlns:aink="http://schemas.microsoft.com/office/drawing/2016/ink" xmlns:am3d="http://schemas.microsoft.com/office/drawing/2017/model3d" xmlns:o="urn:schemas-microsoft-com:office:office" xmlns:oel="http://schemas.microsoft.com/office/2019/extlst" xmlns:r="http://schemas.openxmlformats.org/officeDocument/2006/relationships" xmlns:m="http://schemas.openxmlformats.org/officeDocument/2006/math" xmlns:v="urn:schemas-microsoft-com:vml" xmlns:wp14="http://schemas.microsoft.com/office/word/2010/wordprocessingDrawing" xmlns:wp="http://schemas.openxmlformats.org/drawingml/2006/wordprocessingDrawing" xmlns:w10="urn:schemas-microsoft-com:office:word" xmlns:w="http://schemas.openxmlformats.org/wordprocessingml/2006/main" xmlns:w14="http://schemas.microsoft.com/office/word/2010/wordml" xmlns:w15="http://schemas.microsoft.com/office/word/2012/wordml" xmlns:w16cex="http://schemas.microsoft.com/office/word/2018/wordml/cex" xmlns:w16cid="http://schemas.microsoft.com/office/word/2016/wordml/cid" xmlns:w16="http://schemas.microsoft.com/office/word/2018/wordml" xmlns:w16du="http://schemas.microsoft.com/office/word/2023/wordml/word16du" xmlns:w16sdtdh="http://schemas.microsoft.com/office/word/2020/wordml/sdtdatahash" xmlns:w16sdtfl="http://schemas.microsoft.com/office/word/2024/wordml/sdtformatlock" xmlns:w16se="http://schemas.microsoft.com/office/word/2015/wordml/symex" xmlns:wpg="http://schemas.microsoft.com/office/word/2010/wordprocessingGroup" xmlns:wpi="http://schemas.microsoft.com/office/word/2010/wordprocessingInk" xmlns:wne="http://schemas.microsoft.com/office/word/2006/wordml" xmlns:wps="http://schemas.microsoft.com/office/word/2010/wordprocessingShape" mc:Ignorable="w14 w15 w16se w16cid w16 w16cex w16sdtdh w16sdtfl w16du wp14">
+<w:document xmlns:wpc="http://schemas.microsoft.com/office/word/2010/wordprocessingCanvas" xmlns:cx="http://schemas.microsoft.com/office/drawing/2014/chartex" xmlns:cx1="http://schemas.microsoft.com/office/drawing/2015/9/8/chartex" xmlns:cx2="http://schemas.microsoft.com/office/drawing/2015/10/21/chartex" xmlns:cx3="http://schemas.microsoft.com/office/drawing/2016/5/9/chartex" xmlns:cx4="http://schemas.microsoft.com/office/drawing/2016/5/10/chartex" xmlns:cx5="http://schemas.microsoft.com/office/drawing/2016/5/11/chartex" xmlns:cx6="http://schemas.microsoft.com/office/drawing/2016/5/12/chartex" xmlns:cx7="http://schemas.microsoft.com/office/drawing/2016/5/13/chartex" xmlns:cx8="http://schemas.microsoft.com/office/drawing/2016/5/14/chartex" xmlns:mc="http://schemas.openxmlformats.org/markup-compatibility/2006" xmlns:m="http://schemas.openxmlformats.org/officeDocument/2006/math" xmlns:aink="http://schemas.microsoft.com/office/drawing/2016/ink" xmlns:am3d="http://schemas.microsoft.com/office/drawing/2017/model3d" xmlns:oel="http://schemas.microsoft.com/office/2019/extlst" xmlns:r="http://schemas.openxmlformats.org/officeDocument/2006/relationships" xmlns:wp14="http://schemas.microsoft.com/office/word/2010/wordprocessingDrawing" xmlns:wp="http://schemas.openxmlformats.org/drawingml/2006/wordprocessingDrawing" xmlns:wpg="http://schemas.microsoft.com/office/word/2010/wordprocessingGroup" xmlns:wpi="http://schemas.microsoft.com/office/word/2010/wordprocessingInk" xmlns:wps="http://schemas.microsoft.com/office/word/2010/wordprocessingShape" xmlns:o="urn:schemas-microsoft-com:office:office" xmlns:v="urn:schemas-microsoft-com:vml" xmlns:w10="urn:schemas-microsoft-com:office:word" xmlns:w="http://schemas.openxmlformats.org/wordprocessingml/2006/main" xmlns:w14="http://schemas.microsoft.com/office/word/2010/wordml" xmlns:w15="http://schemas.microsoft.com/office/word/2012/wordml" xmlns:w16cei="http://schemas.microsoft.com/office/word/2026/wordml/cei" xmlns:w16cex="http://schemas.microsoft.com/office/word/2018/wordml/cex" xmlns:w16cid="http://schemas.microsoft.com/office/word/2016/wordml/cid" xmlns:w16="http://schemas.microsoft.com/office/word/2018/wordml" xmlns:w16sdtdh="http://schemas.microsoft.com/office/word/2020/wordml/sdtdatahash" xmlns:w16sdtfl="http://schemas.microsoft.com/office/word/2024/wordml/sdtformatlock" xmlns:w16se="http://schemas.microsoft.com/office/word/2015/wordml/symex" xmlns:w16du="http://schemas.microsoft.com/office/word/2023/wordml/word16du" xmlns:wne="http://schemas.microsoft.com/office/word/2006/wordml" mc:Ignorable="w14 w15 w16se w16cid w16 w16cex w16sdtdh w16sdtfl w16du wp14">
   <w:body>
     <w:p>
       <w:pPr>
@@ -650,6 +650,249 @@
           <w:sz w:val="24"/>
           <w:szCs w:val="24"/>
         </w:rPr>
+        <w:t>RESEARCH INTERESTS</w:t>
+      </w:r>
+    </w:p>
+    <w:p>
+      <w:pPr>
+        <w:tabs>
+          <w:tab w:val="right" w:pos="9360"/>
+        </w:tabs>
+        <w:autoSpaceDE w:val="0"/>
+        <w:autoSpaceDN w:val="0"/>
+        <w:adjustRightInd w:val="0"/>
+        <w:spacing w:after="0" w:line="240" w:lineRule="auto"/>
+        <w:rPr>
+          <w:rFonts w:ascii="Times New Roman" w:hAnsi="Times New Roman" w:cs="Times New Roman"/>
+          <w:iCs/>
+          <w:sz w:val="24"/>
+          <w:szCs w:val="24"/>
+        </w:rPr>
+      </w:pPr>
+      <w:r>
+        <w:rPr>
+          <w:rFonts w:ascii="Times New Roman" w:hAnsi="Times New Roman" w:cs="Times New Roman"/>
+          <w:sz w:val="24"/>
+          <w:szCs w:val="24"/>
+        </w:rPr>
+        <w:t>Reliable and trustworthy machine learning, AI evaluation, uncertainty quantification, applications to biomedical domains</w:t>
+      </w:r>
+    </w:p>
+    <w:p>
+      <w:pPr>
+        <w:pBdr>
+          <w:bottom w:val="single" w:sz="4" w:space="1" w:color="auto"/>
+        </w:pBdr>
+        <w:spacing w:after="60"/>
+        <w:rPr>
+          <w:rFonts w:ascii="Times New Roman" w:hAnsi="Times New Roman" w:cs="Times New Roman"/>
+          <w:b/>
+          <w:sz w:val="24"/>
+          <w:szCs w:val="24"/>
+        </w:rPr>
+      </w:pPr>
+    </w:p>
+    <w:p>
+      <w:pPr>
+        <w:pBdr>
+          <w:bottom w:val="single" w:sz="4" w:space="1" w:color="auto"/>
+        </w:pBdr>
+        <w:spacing w:after="60"/>
+        <w:rPr>
+          <w:rFonts w:ascii="Times New Roman" w:hAnsi="Times New Roman" w:cs="Times New Roman"/>
+          <w:b/>
+          <w:sz w:val="24"/>
+          <w:szCs w:val="24"/>
+        </w:rPr>
+      </w:pPr>
+      <w:r>
+        <w:rPr>
+          <w:rFonts w:ascii="Times New Roman" w:hAnsi="Times New Roman" w:cs="Times New Roman"/>
+          <w:b/>
+          <w:sz w:val="24"/>
+          <w:szCs w:val="24"/>
+        </w:rPr>
+        <w:t xml:space="preserve">SELECTED </w:t>
+      </w:r>
+      <w:r>
+        <w:rPr>
+          <w:rFonts w:ascii="Times New Roman" w:hAnsi="Times New Roman" w:cs="Times New Roman"/>
+          <w:b/>
+          <w:sz w:val="24"/>
+          <w:szCs w:val="24"/>
+        </w:rPr>
+        <w:t xml:space="preserve">HONORS &amp; AWARDS </w:t>
+      </w:r>
+    </w:p>
+    <w:p>
+      <w:pPr>
+        <w:tabs>
+          <w:tab w:val="right" w:pos="9360"/>
+        </w:tabs>
+        <w:autoSpaceDE w:val="0"/>
+        <w:autoSpaceDN w:val="0"/>
+        <w:adjustRightInd w:val="0"/>
+        <w:spacing w:after="0" w:line="240" w:lineRule="auto"/>
+        <w:rPr>
+          <w:rFonts w:ascii="Times New Roman" w:hAnsi="Times New Roman" w:cs="Times New Roman"/>
+          <w:sz w:val="24"/>
+          <w:szCs w:val="24"/>
+        </w:rPr>
+      </w:pPr>
+      <w:r>
+        <w:rPr>
+          <w:rFonts w:ascii="Times New Roman" w:hAnsi="Times New Roman" w:cs="Times New Roman"/>
+          <w:sz w:val="24"/>
+          <w:szCs w:val="24"/>
+        </w:rPr>
+        <w:t>MIT Envisioning the Future of Computing Essay, Honorable Mention</w:t>
+      </w:r>
+      <w:r>
+        <w:rPr>
+          <w:rFonts w:ascii="Times New Roman" w:hAnsi="Times New Roman" w:cs="Times New Roman"/>
+          <w:sz w:val="24"/>
+          <w:szCs w:val="24"/>
+        </w:rPr>
+        <w:tab/>
+        <w:t>2023</w:t>
+      </w:r>
+    </w:p>
+    <w:p>
+      <w:pPr>
+        <w:tabs>
+          <w:tab w:val="right" w:pos="9360"/>
+        </w:tabs>
+        <w:autoSpaceDE w:val="0"/>
+        <w:autoSpaceDN w:val="0"/>
+        <w:adjustRightInd w:val="0"/>
+        <w:spacing w:after="0" w:line="240" w:lineRule="auto"/>
+        <w:rPr>
+          <w:rFonts w:ascii="Times New Roman" w:hAnsi="Times New Roman" w:cs="Times New Roman"/>
+          <w:iCs/>
+          <w:sz w:val="24"/>
+          <w:szCs w:val="24"/>
+        </w:rPr>
+      </w:pPr>
+      <w:r>
+        <w:rPr>
+          <w:rFonts w:ascii="Times New Roman" w:hAnsi="Times New Roman" w:cs="Times New Roman"/>
+          <w:sz w:val="24"/>
+          <w:szCs w:val="24"/>
+        </w:rPr>
+        <w:t>National Science Foundation Graduate Research Fellowship</w:t>
+      </w:r>
+      <w:r>
+        <w:rPr>
+          <w:rFonts w:ascii="Times New Roman" w:hAnsi="Times New Roman" w:cs="Times New Roman"/>
+          <w:sz w:val="24"/>
+          <w:szCs w:val="24"/>
+        </w:rPr>
+        <w:tab/>
+      </w:r>
+      <w:r>
+        <w:rPr>
+          <w:rFonts w:ascii="Times New Roman" w:hAnsi="Times New Roman" w:cs="Times New Roman"/>
+          <w:iCs/>
+          <w:sz w:val="24"/>
+          <w:szCs w:val="24"/>
+        </w:rPr>
+        <w:t>20</w:t>
+      </w:r>
+      <w:r>
+        <w:rPr>
+          <w:rFonts w:ascii="Times New Roman" w:hAnsi="Times New Roman" w:cs="Times New Roman"/>
+          <w:iCs/>
+          <w:sz w:val="24"/>
+          <w:szCs w:val="24"/>
+        </w:rPr>
+        <w:t>22</w:t>
+      </w:r>
+    </w:p>
+    <w:p>
+      <w:pPr>
+        <w:tabs>
+          <w:tab w:val="right" w:pos="9360"/>
+        </w:tabs>
+        <w:autoSpaceDE w:val="0"/>
+        <w:autoSpaceDN w:val="0"/>
+        <w:adjustRightInd w:val="0"/>
+        <w:spacing w:after="0" w:line="240" w:lineRule="auto"/>
+        <w:rPr>
+          <w:rFonts w:ascii="Times New Roman" w:hAnsi="Times New Roman" w:cs="Times New Roman"/>
+          <w:iCs/>
+          <w:sz w:val="24"/>
+          <w:szCs w:val="24"/>
+        </w:rPr>
+      </w:pPr>
+      <w:r>
+        <w:rPr>
+          <w:rFonts w:ascii="Times New Roman" w:hAnsi="Times New Roman" w:cs="Times New Roman"/>
+          <w:sz w:val="24"/>
+          <w:szCs w:val="24"/>
+        </w:rPr>
+        <w:t>Hertz Foundation Fellowship</w:t>
+      </w:r>
+      <w:r>
+        <w:rPr>
+          <w:rFonts w:ascii="Times New Roman" w:hAnsi="Times New Roman" w:cs="Times New Roman"/>
+          <w:sz w:val="24"/>
+          <w:szCs w:val="24"/>
+        </w:rPr>
+        <w:tab/>
+      </w:r>
+      <w:r>
+        <w:rPr>
+          <w:rFonts w:ascii="Times New Roman" w:hAnsi="Times New Roman" w:cs="Times New Roman"/>
+          <w:iCs/>
+          <w:sz w:val="24"/>
+          <w:szCs w:val="24"/>
+        </w:rPr>
+        <w:t>20</w:t>
+      </w:r>
+      <w:r>
+        <w:rPr>
+          <w:rFonts w:ascii="Times New Roman" w:hAnsi="Times New Roman" w:cs="Times New Roman"/>
+          <w:iCs/>
+          <w:sz w:val="24"/>
+          <w:szCs w:val="24"/>
+        </w:rPr>
+        <w:t>22</w:t>
+      </w:r>
+    </w:p>
+    <w:p>
+      <w:pPr>
+        <w:pBdr>
+          <w:bottom w:val="single" w:sz="4" w:space="1" w:color="auto"/>
+        </w:pBdr>
+        <w:spacing w:after="60"/>
+        <w:rPr>
+          <w:rFonts w:ascii="Times New Roman" w:hAnsi="Times New Roman" w:cs="Times New Roman"/>
+          <w:b/>
+          <w:sz w:val="24"/>
+          <w:szCs w:val="24"/>
+        </w:rPr>
+      </w:pPr>
+    </w:p>
+    <w:p>
+      <w:pPr>
+        <w:pBdr>
+          <w:bottom w:val="single" w:sz="4" w:space="1" w:color="auto"/>
+        </w:pBdr>
+        <w:spacing w:after="60"/>
+        <w:rPr>
+          <w:rFonts w:ascii="Times New Roman" w:hAnsi="Times New Roman" w:cs="Times New Roman"/>
+          <w:b/>
+          <w:sz w:val="24"/>
+          <w:szCs w:val="24"/>
+        </w:rPr>
+      </w:pPr>
+      <w:r>
+        <w:rPr>
+          <w:rFonts w:ascii="Times New Roman" w:hAnsi="Times New Roman" w:cs="Times New Roman"/>
+          <w:b/>
+          <w:sz w:val="24"/>
+          <w:szCs w:val="24"/>
+        </w:rPr>
         <w:t xml:space="preserve">PREPRINTS </w:t>
       </w:r>
       <w:r>
@@ -850,7 +1093,163 @@
           <w:sz w:val="24"/>
           <w:szCs w:val="24"/>
         </w:rPr>
-        <w:t>E-</w:t>
+        <w:t>E-valuator: Reliable Agent Verifiers with Sequential Hypothesis Testing</w:t>
+      </w:r>
+      <w:r>
+        <w:rPr>
+          <w:rFonts w:ascii="Times New Roman" w:hAnsi="Times New Roman" w:cs="Times New Roman"/>
+          <w:bCs/>
+          <w:sz w:val="24"/>
+          <w:szCs w:val="24"/>
+        </w:rPr>
+        <w:t xml:space="preserve">. Preprint </w:t>
+      </w:r>
+      <w:r>
+        <w:rPr>
+          <w:rFonts w:ascii="Times New Roman" w:hAnsi="Times New Roman" w:cs="Times New Roman"/>
+          <w:bCs/>
+          <w:sz w:val="24"/>
+          <w:szCs w:val="24"/>
+        </w:rPr>
+        <w:t xml:space="preserve">2026 </w:t>
+      </w:r>
+      <w:r>
+        <w:rPr>
+          <w:rFonts w:ascii="Times New Roman" w:hAnsi="Times New Roman" w:cs="Times New Roman"/>
+          <w:bCs/>
+          <w:sz w:val="24"/>
+          <w:szCs w:val="24"/>
+        </w:rPr>
+        <w:t>(</w:t>
+      </w:r>
+      <w:proofErr w:type="spellStart"/>
+      <w:r>
+        <w:fldChar w:fldCharType="begin"/>
+      </w:r>
+      <w:r>
+        <w:instrText>HYPERLINK "https://arxiv.org/abs/2512.03109"</w:instrText>
+      </w:r>
+      <w:r>
+        <w:fldChar w:fldCharType="separate"/>
+      </w:r>
+      <w:r>
+        <w:rPr>
+          <w:rStyle w:val="Hyperlink"/>
+          <w:rFonts w:ascii="Times New Roman" w:hAnsi="Times New Roman" w:cs="Times New Roman"/>
+          <w:bCs/>
+          <w:sz w:val="24"/>
+          <w:szCs w:val="24"/>
+        </w:rPr>
+        <w:t>arxiv</w:t>
+      </w:r>
+      <w:proofErr w:type="spellEnd"/>
+      <w:r>
+        <w:fldChar w:fldCharType="end"/>
+      </w:r>
+      <w:r>
+        <w:rPr>
+          <w:rFonts w:ascii="Times New Roman" w:hAnsi="Times New Roman" w:cs="Times New Roman"/>
+          <w:bCs/>
+          <w:sz w:val="24"/>
+          <w:szCs w:val="24"/>
+        </w:rPr>
+        <w:t>)</w:t>
+      </w:r>
+    </w:p>
+    <w:p>
+      <w:pPr>
+        <w:autoSpaceDE w:val="0"/>
+        <w:autoSpaceDN w:val="0"/>
+        <w:adjustRightInd w:val="0"/>
+        <w:spacing w:after="0" w:line="240" w:lineRule="auto"/>
+        <w:rPr>
+          <w:rFonts w:ascii="Times New Roman" w:hAnsi="Times New Roman" w:cs="Times New Roman"/>
+          <w:bCs/>
+          <w:sz w:val="24"/>
+          <w:szCs w:val="24"/>
+        </w:rPr>
+      </w:pPr>
+    </w:p>
+    <w:p>
+      <w:pPr>
+        <w:autoSpaceDE w:val="0"/>
+        <w:autoSpaceDN w:val="0"/>
+        <w:adjustRightInd w:val="0"/>
+        <w:spacing w:after="0" w:line="240" w:lineRule="auto"/>
+        <w:rPr>
+          <w:rFonts w:ascii="Times New Roman" w:hAnsi="Times New Roman" w:cs="Times New Roman"/>
+          <w:bCs/>
+          <w:sz w:val="24"/>
+          <w:szCs w:val="24"/>
+        </w:rPr>
+      </w:pPr>
+      <w:r>
+        <w:rPr>
+          <w:rFonts w:ascii="Times New Roman" w:hAnsi="Times New Roman" w:cs="Times New Roman"/>
+          <w:bCs/>
+          <w:sz w:val="24"/>
+          <w:szCs w:val="24"/>
+        </w:rPr>
+        <w:t xml:space="preserve">[w] </w:t>
+      </w:r>
+      <w:r>
+        <w:rPr>
+          <w:rFonts w:ascii="Times New Roman" w:hAnsi="Times New Roman" w:cs="Times New Roman"/>
+          <w:bCs/>
+          <w:sz w:val="24"/>
+          <w:szCs w:val="24"/>
+          <w:u w:val="single"/>
+        </w:rPr>
+        <w:t>S. Sadhuka</w:t>
+      </w:r>
+      <w:r>
+        <w:rPr>
+          <w:rFonts w:ascii="Times New Roman" w:hAnsi="Times New Roman" w:cs="Times New Roman"/>
+          <w:bCs/>
+          <w:sz w:val="24"/>
+          <w:szCs w:val="24"/>
+        </w:rPr>
+        <w:t xml:space="preserve">, S. </w:t>
+      </w:r>
+      <w:proofErr w:type="spellStart"/>
+      <w:r>
+        <w:rPr>
+          <w:rFonts w:ascii="Times New Roman" w:hAnsi="Times New Roman" w:cs="Times New Roman"/>
+          <w:bCs/>
+          <w:sz w:val="24"/>
+          <w:szCs w:val="24"/>
+        </w:rPr>
+        <w:t>Dandapanthula</w:t>
+      </w:r>
+      <w:proofErr w:type="spellEnd"/>
+      <w:r>
+        <w:rPr>
+          <w:rFonts w:ascii="Times New Roman" w:hAnsi="Times New Roman" w:cs="Times New Roman"/>
+          <w:bCs/>
+          <w:sz w:val="24"/>
+          <w:szCs w:val="24"/>
+        </w:rPr>
+        <w:t xml:space="preserve">, S. Khan, M. Oberst, B. Berger, A. </w:t>
+      </w:r>
+      <w:proofErr w:type="spellStart"/>
+      <w:r>
+        <w:rPr>
+          <w:rFonts w:ascii="Times New Roman" w:hAnsi="Times New Roman" w:cs="Times New Roman"/>
+          <w:bCs/>
+          <w:sz w:val="24"/>
+          <w:szCs w:val="24"/>
+        </w:rPr>
+        <w:t>Chouldechova</w:t>
+      </w:r>
+      <w:proofErr w:type="spellEnd"/>
+      <w:r>
+        <w:rPr>
+          <w:rFonts w:ascii="Times New Roman" w:hAnsi="Times New Roman" w:cs="Times New Roman"/>
+          <w:bCs/>
+          <w:sz w:val="24"/>
+          <w:szCs w:val="24"/>
+        </w:rPr>
+        <w:t xml:space="preserve">. </w:t>
       </w:r>
       <w:r>
         <w:rPr>
@@ -861,7 +1260,7 @@
           <w:sz w:val="24"/>
           <w:szCs w:val="24"/>
         </w:rPr>
-        <w:t>val</w:t>
+        <w:t>Calibrated but Correlated: Shared Residuals among LLM Ju</w:t>
       </w:r>
       <w:r>
         <w:rPr>
@@ -872,7 +1271,81 @@
           <w:sz w:val="24"/>
           <w:szCs w:val="24"/>
         </w:rPr>
-        <w:t>uator</w:t>
+        <w:t>dges Distorts Model Selection</w:t>
+      </w:r>
+      <w:r>
+        <w:rPr>
+          <w:rFonts w:ascii="Times New Roman" w:hAnsi="Times New Roman" w:cs="Times New Roman"/>
+          <w:bCs/>
+          <w:sz w:val="24"/>
+          <w:szCs w:val="24"/>
+        </w:rPr>
+        <w:t xml:space="preserve">. </w:t>
+      </w:r>
+      <w:r>
+        <w:rPr>
+          <w:rFonts w:ascii="Times New Roman" w:hAnsi="Times New Roman" w:cs="Times New Roman"/>
+          <w:bCs/>
+          <w:sz w:val="24"/>
+          <w:szCs w:val="24"/>
+        </w:rPr>
+        <w:t>In progress.</w:t>
+      </w:r>
+    </w:p>
+    <w:p>
+      <w:pPr>
+        <w:autoSpaceDE w:val="0"/>
+        <w:autoSpaceDN w:val="0"/>
+        <w:adjustRightInd w:val="0"/>
+        <w:spacing w:after="0" w:line="240" w:lineRule="auto"/>
+        <w:rPr>
+          <w:rFonts w:ascii="Times New Roman" w:hAnsi="Times New Roman" w:cs="Times New Roman"/>
+          <w:bCs/>
+          <w:sz w:val="24"/>
+          <w:szCs w:val="24"/>
+        </w:rPr>
+      </w:pPr>
+    </w:p>
+    <w:p>
+      <w:pPr>
+        <w:autoSpaceDE w:val="0"/>
+        <w:autoSpaceDN w:val="0"/>
+        <w:adjustRightInd w:val="0"/>
+        <w:spacing w:after="0" w:line="240" w:lineRule="auto"/>
+        <w:rPr>
+          <w:rFonts w:ascii="Times New Roman" w:hAnsi="Times New Roman" w:cs="Times New Roman"/>
+          <w:bCs/>
+          <w:sz w:val="24"/>
+          <w:szCs w:val="24"/>
+        </w:rPr>
+      </w:pPr>
+      <w:r>
+        <w:rPr>
+          <w:rFonts w:ascii="Times New Roman" w:hAnsi="Times New Roman" w:cs="Times New Roman"/>
+          <w:bCs/>
+          <w:sz w:val="24"/>
+          <w:szCs w:val="24"/>
+        </w:rPr>
+        <w:t xml:space="preserve">[p] S. Balachandar, </w:t>
+      </w:r>
+      <w:r>
+        <w:rPr>
+          <w:rFonts w:ascii="Times New Roman" w:hAnsi="Times New Roman" w:cs="Times New Roman"/>
+          <w:bCs/>
+          <w:sz w:val="24"/>
+          <w:szCs w:val="24"/>
+          <w:u w:val="single"/>
+        </w:rPr>
+        <w:t>S. Sadhuka</w:t>
+      </w:r>
+      <w:r>
+        <w:rPr>
+          <w:rFonts w:ascii="Times New Roman" w:hAnsi="Times New Roman" w:cs="Times New Roman"/>
+          <w:bCs/>
+          <w:sz w:val="24"/>
+          <w:szCs w:val="24"/>
+        </w:rPr>
+        <w:t xml:space="preserve">, B. Berger, E. Pierson, N. Garg. </w:t>
       </w:r>
       <w:r>
         <w:rPr>
@@ -883,7 +1356,72 @@
           <w:sz w:val="24"/>
           <w:szCs w:val="24"/>
         </w:rPr>
-        <w:t xml:space="preserve">: </w:t>
+        <w:t>Urban Incident Prediction with Graph Neural Networks: Integrating Government Ratings and Crowdsourced Reports</w:t>
+      </w:r>
+      <w:r>
+        <w:rPr>
+          <w:rFonts w:ascii="Times New Roman" w:hAnsi="Times New Roman" w:cs="Times New Roman"/>
+          <w:bCs/>
+          <w:sz w:val="24"/>
+          <w:szCs w:val="24"/>
+        </w:rPr>
+        <w:t>. AAAI 2026</w:t>
+      </w:r>
+    </w:p>
+    <w:p>
+      <w:pPr>
+        <w:autoSpaceDE w:val="0"/>
+        <w:autoSpaceDN w:val="0"/>
+        <w:adjustRightInd w:val="0"/>
+        <w:spacing w:after="0" w:line="240" w:lineRule="auto"/>
+        <w:rPr>
+          <w:rFonts w:ascii="Times New Roman" w:hAnsi="Times New Roman" w:cs="Times New Roman"/>
+          <w:bCs/>
+          <w:sz w:val="24"/>
+          <w:szCs w:val="24"/>
+        </w:rPr>
+      </w:pPr>
+    </w:p>
+    <w:p>
+      <w:pPr>
+        <w:autoSpaceDE w:val="0"/>
+        <w:autoSpaceDN w:val="0"/>
+        <w:adjustRightInd w:val="0"/>
+        <w:spacing w:after="0" w:line="240" w:lineRule="auto"/>
+        <w:rPr>
+          <w:rFonts w:ascii="Times New Roman" w:hAnsi="Times New Roman" w:cs="Times New Roman"/>
+          <w:bCs/>
+          <w:sz w:val="24"/>
+          <w:szCs w:val="24"/>
+        </w:rPr>
+      </w:pPr>
+      <w:r>
+        <w:rPr>
+          <w:rFonts w:ascii="Times New Roman" w:hAnsi="Times New Roman" w:cs="Times New Roman"/>
+          <w:bCs/>
+          <w:sz w:val="24"/>
+          <w:szCs w:val="24"/>
+        </w:rPr>
+        <w:t xml:space="preserve">[p] D. Shanmugam*, </w:t>
+      </w:r>
+      <w:r>
+        <w:rPr>
+          <w:rFonts w:ascii="Times New Roman" w:hAnsi="Times New Roman" w:cs="Times New Roman"/>
+          <w:bCs/>
+          <w:sz w:val="24"/>
+          <w:szCs w:val="24"/>
+          <w:u w:val="single"/>
+        </w:rPr>
+        <w:t>S. Sadhuka</w:t>
+      </w:r>
+      <w:r>
+        <w:rPr>
+          <w:rFonts w:ascii="Times New Roman" w:hAnsi="Times New Roman" w:cs="Times New Roman"/>
+          <w:bCs/>
+          <w:sz w:val="24"/>
+          <w:szCs w:val="24"/>
+        </w:rPr>
+        <w:t xml:space="preserve">*, M. Raghavan, J. Guttag, B. Berger, E. Pierson. </w:t>
       </w:r>
       <w:r>
         <w:rPr>
@@ -894,7 +1432,92 @@
           <w:sz w:val="24"/>
           <w:szCs w:val="24"/>
         </w:rPr>
-        <w:t>Reliable Agent Verifiers</w:t>
+        <w:t>Evaluating multiple models using labeled and unlabeled data</w:t>
+      </w:r>
+      <w:r>
+        <w:rPr>
+          <w:rFonts w:ascii="Times New Roman" w:hAnsi="Times New Roman" w:cs="Times New Roman"/>
+          <w:bCs/>
+          <w:sz w:val="24"/>
+          <w:szCs w:val="24"/>
+        </w:rPr>
+        <w:t xml:space="preserve">. </w:t>
+      </w:r>
+      <w:proofErr w:type="spellStart"/>
+      <w:r>
+        <w:rPr>
+          <w:rFonts w:ascii="Times New Roman" w:hAnsi="Times New Roman" w:cs="Times New Roman"/>
+          <w:bCs/>
+          <w:sz w:val="24"/>
+          <w:szCs w:val="24"/>
+        </w:rPr>
+        <w:t>NeurIPS</w:t>
+      </w:r>
+      <w:proofErr w:type="spellEnd"/>
+      <w:r>
+        <w:rPr>
+          <w:rFonts w:ascii="Times New Roman" w:hAnsi="Times New Roman" w:cs="Times New Roman"/>
+          <w:bCs/>
+          <w:sz w:val="24"/>
+          <w:szCs w:val="24"/>
+        </w:rPr>
+        <w:t xml:space="preserve"> 2025</w:t>
+      </w:r>
+    </w:p>
+    <w:p>
+      <w:pPr>
+        <w:autoSpaceDE w:val="0"/>
+        <w:autoSpaceDN w:val="0"/>
+        <w:adjustRightInd w:val="0"/>
+        <w:spacing w:after="0" w:line="240" w:lineRule="auto"/>
+        <w:rPr>
+          <w:rFonts w:ascii="Times New Roman" w:hAnsi="Times New Roman" w:cs="Times New Roman"/>
+          <w:bCs/>
+          <w:sz w:val="24"/>
+          <w:szCs w:val="24"/>
+        </w:rPr>
+      </w:pPr>
+    </w:p>
+    <w:p>
+      <w:pPr>
+        <w:autoSpaceDE w:val="0"/>
+        <w:autoSpaceDN w:val="0"/>
+        <w:adjustRightInd w:val="0"/>
+        <w:spacing w:after="0" w:line="240" w:lineRule="auto"/>
+        <w:rPr>
+          <w:rFonts w:ascii="Times New Roman" w:hAnsi="Times New Roman" w:cs="Times New Roman"/>
+          <w:bCs/>
+          <w:sz w:val="24"/>
+          <w:szCs w:val="24"/>
+        </w:rPr>
+      </w:pPr>
+      <w:r>
+        <w:rPr>
+          <w:rFonts w:ascii="Times New Roman" w:hAnsi="Times New Roman" w:cs="Times New Roman"/>
+          <w:bCs/>
+          <w:sz w:val="24"/>
+          <w:szCs w:val="24"/>
+        </w:rPr>
+        <w:t xml:space="preserve">[p] </w:t>
+      </w:r>
+      <w:r>
+        <w:rPr>
+          <w:rFonts w:ascii="Times New Roman" w:hAnsi="Times New Roman" w:cs="Times New Roman"/>
+          <w:bCs/>
+          <w:sz w:val="24"/>
+          <w:szCs w:val="24"/>
+          <w:u w:val="single"/>
+        </w:rPr>
+        <w:t>S. Sadhuka</w:t>
+      </w:r>
+      <w:r>
+        <w:rPr>
+          <w:rFonts w:ascii="Times New Roman" w:hAnsi="Times New Roman" w:cs="Times New Roman"/>
+          <w:bCs/>
+          <w:sz w:val="24"/>
+          <w:szCs w:val="24"/>
+        </w:rPr>
+        <w:t xml:space="preserve">, S. Lin, B. Berger**. E. Pierson**. </w:t>
       </w:r>
       <w:r>
         <w:rPr>
@@ -905,7 +1528,7 @@
           <w:sz w:val="24"/>
           <w:szCs w:val="24"/>
         </w:rPr>
-        <w:t xml:space="preserve"> with Sequential Hypothesis Testing</w:t>
+        <w:t>A Bayesian Model for Multi-stage Censoring</w:t>
       </w:r>
       <w:r>
         <w:rPr>
@@ -923,31 +1546,25 @@
           <w:sz w:val="24"/>
           <w:szCs w:val="24"/>
         </w:rPr>
-        <w:t>Preprint (</w:t>
-      </w:r>
-      <w:proofErr w:type="spellStart"/>
-      <w:r>
-        <w:fldChar w:fldCharType="begin"/>
-      </w:r>
-      <w:r>
-        <w:instrText>HYPERLINK "https://arxiv.org/abs/2512.03109"</w:instrText>
-      </w:r>
-      <w:r>
-        <w:fldChar w:fldCharType="separate"/>
-      </w:r>
-      <w:r>
-        <w:rPr>
-          <w:rStyle w:val="Hyperlink"/>
-          <w:rFonts w:ascii="Times New Roman" w:hAnsi="Times New Roman" w:cs="Times New Roman"/>
-          <w:bCs/>
-          <w:sz w:val="24"/>
-          <w:szCs w:val="24"/>
-        </w:rPr>
-        <w:t>arxiv</w:t>
-      </w:r>
-      <w:proofErr w:type="spellEnd"/>
-      <w:r>
-        <w:fldChar w:fldCharType="end"/>
+        <w:t>ML4H 2025</w:t>
+      </w:r>
+      <w:r>
+        <w:rPr>
+          <w:rFonts w:ascii="Times New Roman" w:hAnsi="Times New Roman" w:cs="Times New Roman"/>
+          <w:bCs/>
+          <w:sz w:val="24"/>
+          <w:szCs w:val="24"/>
+        </w:rPr>
+        <w:t xml:space="preserve"> (proceedings</w:t>
+      </w:r>
+      <w:r>
+        <w:rPr>
+          <w:rFonts w:ascii="Times New Roman" w:hAnsi="Times New Roman" w:cs="Times New Roman"/>
+          <w:bCs/>
+          <w:sz w:val="24"/>
+          <w:szCs w:val="24"/>
+        </w:rPr>
+        <w:t xml:space="preserve"> track</w:t>
       </w:r>
       <w:r>
         <w:rPr>
@@ -958,88 +1575,50 @@
         </w:rPr>
         <w:t>)</w:t>
       </w:r>
-    </w:p>
-    <w:p>
-      <w:pPr>
-        <w:autoSpaceDE w:val="0"/>
-        <w:autoSpaceDN w:val="0"/>
-        <w:adjustRightInd w:val="0"/>
-        <w:spacing w:after="0" w:line="240" w:lineRule="auto"/>
-        <w:rPr>
-          <w:rFonts w:ascii="Times New Roman" w:hAnsi="Times New Roman" w:cs="Times New Roman"/>
-          <w:bCs/>
-          <w:sz w:val="24"/>
-          <w:szCs w:val="24"/>
-        </w:rPr>
-      </w:pPr>
-    </w:p>
-    <w:p>
-      <w:pPr>
-        <w:autoSpaceDE w:val="0"/>
-        <w:autoSpaceDN w:val="0"/>
-        <w:adjustRightInd w:val="0"/>
-        <w:spacing w:after="0" w:line="240" w:lineRule="auto"/>
-        <w:rPr>
-          <w:rFonts w:ascii="Times New Roman" w:hAnsi="Times New Roman" w:cs="Times New Roman"/>
-          <w:bCs/>
-          <w:sz w:val="24"/>
-          <w:szCs w:val="24"/>
-        </w:rPr>
-      </w:pPr>
-      <w:r>
-        <w:rPr>
-          <w:rFonts w:ascii="Times New Roman" w:hAnsi="Times New Roman" w:cs="Times New Roman"/>
-          <w:bCs/>
-          <w:sz w:val="24"/>
-          <w:szCs w:val="24"/>
-        </w:rPr>
-        <w:t>[</w:t>
-      </w:r>
-      <w:r>
-        <w:rPr>
-          <w:rFonts w:ascii="Times New Roman" w:hAnsi="Times New Roman" w:cs="Times New Roman"/>
-          <w:bCs/>
-          <w:sz w:val="24"/>
-          <w:szCs w:val="24"/>
-        </w:rPr>
-        <w:t>p</w:t>
-      </w:r>
-      <w:r>
-        <w:rPr>
-          <w:rFonts w:ascii="Times New Roman" w:hAnsi="Times New Roman" w:cs="Times New Roman"/>
-          <w:bCs/>
-          <w:sz w:val="24"/>
-          <w:szCs w:val="24"/>
-        </w:rPr>
-        <w:t xml:space="preserve">] </w:t>
-      </w:r>
-      <w:r>
-        <w:rPr>
-          <w:rFonts w:ascii="Times New Roman" w:hAnsi="Times New Roman" w:cs="Times New Roman"/>
-          <w:bCs/>
-          <w:sz w:val="24"/>
-          <w:szCs w:val="24"/>
-        </w:rPr>
-        <w:t xml:space="preserve">S. Balachandar, </w:t>
-      </w:r>
-      <w:r>
-        <w:rPr>
-          <w:rFonts w:ascii="Times New Roman" w:hAnsi="Times New Roman" w:cs="Times New Roman"/>
-          <w:bCs/>
-          <w:sz w:val="24"/>
-          <w:szCs w:val="24"/>
-          <w:u w:val="single"/>
-        </w:rPr>
-        <w:t>S. Sadhuka</w:t>
-      </w:r>
-      <w:r>
-        <w:rPr>
-          <w:rFonts w:ascii="Times New Roman" w:hAnsi="Times New Roman" w:cs="Times New Roman"/>
-          <w:bCs/>
-          <w:sz w:val="24"/>
-          <w:szCs w:val="24"/>
-        </w:rPr>
-        <w:t xml:space="preserve">, B. Berger, E. Pierson, N. Garg. </w:t>
+      <w:r>
+        <w:rPr>
+          <w:rFonts w:ascii="Times New Roman" w:hAnsi="Times New Roman" w:cs="Times New Roman"/>
+          <w:bCs/>
+          <w:sz w:val="24"/>
+          <w:szCs w:val="24"/>
+        </w:rPr>
+        <w:t xml:space="preserve">, also </w:t>
+      </w:r>
+      <w:r>
+        <w:rPr>
+          <w:rFonts w:ascii="Times New Roman" w:hAnsi="Times New Roman" w:cs="Times New Roman"/>
+          <w:b/>
+          <w:sz w:val="24"/>
+          <w:szCs w:val="24"/>
+        </w:rPr>
+        <w:t xml:space="preserve">spotlight presentation </w:t>
+      </w:r>
+      <w:r>
+        <w:rPr>
+          <w:rFonts w:ascii="Times New Roman" w:hAnsi="Times New Roman" w:cs="Times New Roman"/>
+          <w:b/>
+          <w:sz w:val="24"/>
+          <w:szCs w:val="24"/>
+        </w:rPr>
+        <w:t>at</w:t>
+      </w:r>
+      <w:r>
+        <w:rPr>
+          <w:rFonts w:ascii="Times New Roman" w:hAnsi="Times New Roman" w:cs="Times New Roman"/>
+          <w:b/>
+          <w:sz w:val="24"/>
+          <w:szCs w:val="24"/>
+        </w:rPr>
+        <w:t xml:space="preserve"> </w:t>
+      </w:r>
+      <w:r>
+        <w:rPr>
+          <w:rFonts w:ascii="Times New Roman" w:hAnsi="Times New Roman" w:cs="Times New Roman"/>
+          <w:bCs/>
+          <w:sz w:val="24"/>
+          <w:szCs w:val="24"/>
+        </w:rPr>
+        <w:t>ML4H</w:t>
       </w:r>
       <w:r>
         <w:rPr>
@@ -1050,7 +1629,110 @@
           <w:sz w:val="24"/>
           <w:szCs w:val="24"/>
         </w:rPr>
-        <w:t>Using GNNs to Model Biased Crowdsourced Data for Urban Applications</w:t>
+        <w:t xml:space="preserve"> </w:t>
+      </w:r>
+      <w:r>
+        <w:rPr>
+          <w:rFonts w:ascii="Times New Roman" w:hAnsi="Times New Roman" w:cs="Times New Roman"/>
+          <w:bCs/>
+          <w:sz w:val="24"/>
+          <w:szCs w:val="24"/>
+        </w:rPr>
+        <w:t>2024 (findings track)</w:t>
+      </w:r>
+    </w:p>
+    <w:p>
+      <w:pPr>
+        <w:autoSpaceDE w:val="0"/>
+        <w:autoSpaceDN w:val="0"/>
+        <w:adjustRightInd w:val="0"/>
+        <w:spacing w:after="0" w:line="240" w:lineRule="auto"/>
+        <w:rPr>
+          <w:rFonts w:ascii="Times New Roman" w:hAnsi="Times New Roman" w:cs="Times New Roman"/>
+          <w:bCs/>
+          <w:sz w:val="24"/>
+          <w:szCs w:val="24"/>
+        </w:rPr>
+      </w:pPr>
+    </w:p>
+    <w:p>
+      <w:pPr>
+        <w:autoSpaceDE w:val="0"/>
+        <w:autoSpaceDN w:val="0"/>
+        <w:adjustRightInd w:val="0"/>
+        <w:spacing w:after="0" w:line="240" w:lineRule="auto"/>
+        <w:rPr>
+          <w:rFonts w:ascii="Times New Roman" w:hAnsi="Times New Roman" w:cs="Times New Roman"/>
+          <w:bCs/>
+          <w:sz w:val="24"/>
+          <w:szCs w:val="24"/>
+        </w:rPr>
+      </w:pPr>
+      <w:r>
+        <w:rPr>
+          <w:rFonts w:ascii="Times New Roman" w:hAnsi="Times New Roman" w:cs="Times New Roman"/>
+          <w:bCs/>
+          <w:sz w:val="24"/>
+          <w:szCs w:val="24"/>
+        </w:rPr>
+        <w:t xml:space="preserve">[p] </w:t>
+      </w:r>
+      <w:r>
+        <w:rPr>
+          <w:rFonts w:ascii="Times New Roman" w:hAnsi="Times New Roman" w:cs="Times New Roman"/>
+          <w:bCs/>
+          <w:sz w:val="24"/>
+          <w:szCs w:val="24"/>
+        </w:rPr>
+        <w:t xml:space="preserve">H. Cho, D. Froelicher*, N. </w:t>
+      </w:r>
+      <w:proofErr w:type="spellStart"/>
+      <w:r>
+        <w:rPr>
+          <w:rFonts w:ascii="Times New Roman" w:hAnsi="Times New Roman" w:cs="Times New Roman"/>
+          <w:bCs/>
+          <w:sz w:val="24"/>
+          <w:szCs w:val="24"/>
+        </w:rPr>
+        <w:t>Dokmai</w:t>
+      </w:r>
+      <w:proofErr w:type="spellEnd"/>
+      <w:r>
+        <w:rPr>
+          <w:rFonts w:ascii="Times New Roman" w:hAnsi="Times New Roman" w:cs="Times New Roman"/>
+          <w:bCs/>
+          <w:sz w:val="24"/>
+          <w:szCs w:val="24"/>
+        </w:rPr>
+        <w:t xml:space="preserve">*, A. Nandi*, </w:t>
+      </w:r>
+      <w:r>
+        <w:rPr>
+          <w:rFonts w:ascii="Times New Roman" w:hAnsi="Times New Roman" w:cs="Times New Roman"/>
+          <w:bCs/>
+          <w:sz w:val="24"/>
+          <w:szCs w:val="24"/>
+          <w:u w:val="single"/>
+        </w:rPr>
+        <w:t>S. Sadhuka</w:t>
+      </w:r>
+      <w:r>
+        <w:rPr>
+          <w:rFonts w:ascii="Times New Roman" w:hAnsi="Times New Roman" w:cs="Times New Roman"/>
+          <w:bCs/>
+          <w:sz w:val="24"/>
+          <w:szCs w:val="24"/>
+        </w:rPr>
+        <w:t xml:space="preserve">*, </w:t>
+      </w:r>
+      <w:r>
+        <w:rPr>
+          <w:rFonts w:ascii="Times New Roman" w:hAnsi="Times New Roman" w:cs="Times New Roman"/>
+          <w:bCs/>
+          <w:sz w:val="24"/>
+          <w:szCs w:val="24"/>
+        </w:rPr>
+        <w:t>M. Hong*, B. Berger</w:t>
       </w:r>
       <w:r>
         <w:rPr>
@@ -1060,80 +1742,6 @@
           <w:szCs w:val="24"/>
         </w:rPr>
         <w:t xml:space="preserve">. </w:t>
-      </w:r>
-      <w:r>
-        <w:rPr>
-          <w:rFonts w:ascii="Times New Roman" w:hAnsi="Times New Roman" w:cs="Times New Roman"/>
-          <w:bCs/>
-          <w:sz w:val="24"/>
-          <w:szCs w:val="24"/>
-        </w:rPr>
-        <w:t xml:space="preserve">AAAI </w:t>
-      </w:r>
-      <w:r>
-        <w:rPr>
-          <w:rFonts w:ascii="Times New Roman" w:hAnsi="Times New Roman" w:cs="Times New Roman"/>
-          <w:bCs/>
-          <w:sz w:val="24"/>
-          <w:szCs w:val="24"/>
-        </w:rPr>
-        <w:t>2026</w:t>
-      </w:r>
-    </w:p>
-    <w:p>
-      <w:pPr>
-        <w:autoSpaceDE w:val="0"/>
-        <w:autoSpaceDN w:val="0"/>
-        <w:adjustRightInd w:val="0"/>
-        <w:spacing w:after="0" w:line="240" w:lineRule="auto"/>
-        <w:rPr>
-          <w:rFonts w:ascii="Times New Roman" w:hAnsi="Times New Roman" w:cs="Times New Roman"/>
-          <w:bCs/>
-          <w:sz w:val="24"/>
-          <w:szCs w:val="24"/>
-        </w:rPr>
-      </w:pPr>
-    </w:p>
-    <w:p>
-      <w:pPr>
-        <w:autoSpaceDE w:val="0"/>
-        <w:autoSpaceDN w:val="0"/>
-        <w:adjustRightInd w:val="0"/>
-        <w:spacing w:after="0" w:line="240" w:lineRule="auto"/>
-        <w:rPr>
-          <w:rFonts w:ascii="Times New Roman" w:hAnsi="Times New Roman" w:cs="Times New Roman"/>
-          <w:bCs/>
-          <w:sz w:val="24"/>
-          <w:szCs w:val="24"/>
-        </w:rPr>
-      </w:pPr>
-      <w:r>
-        <w:rPr>
-          <w:rFonts w:ascii="Times New Roman" w:hAnsi="Times New Roman" w:cs="Times New Roman"/>
-          <w:bCs/>
-          <w:sz w:val="24"/>
-          <w:szCs w:val="24"/>
-        </w:rPr>
-        <w:t xml:space="preserve">[p] D. Shanmugam*, </w:t>
-      </w:r>
-      <w:r>
-        <w:rPr>
-          <w:rFonts w:ascii="Times New Roman" w:hAnsi="Times New Roman" w:cs="Times New Roman"/>
-          <w:bCs/>
-          <w:sz w:val="24"/>
-          <w:szCs w:val="24"/>
-          <w:u w:val="single"/>
-        </w:rPr>
-        <w:t>S. Sadhuka</w:t>
-      </w:r>
-      <w:r>
-        <w:rPr>
-          <w:rFonts w:ascii="Times New Roman" w:hAnsi="Times New Roman" w:cs="Times New Roman"/>
-          <w:bCs/>
-          <w:sz w:val="24"/>
-          <w:szCs w:val="24"/>
-        </w:rPr>
-        <w:t xml:space="preserve">*, M. Raghavan, J. Guttag, B. Berger, E. Pierson. </w:t>
       </w:r>
       <w:r>
         <w:rPr>
@@ -1144,7 +1752,7 @@
           <w:sz w:val="24"/>
           <w:szCs w:val="24"/>
         </w:rPr>
-        <w:t>Evaluating multiple models using labeled and unlabeled data</w:t>
+        <w:t>Privacy-Enhancing Technologies in Biomedical Data Science</w:t>
       </w:r>
       <w:r>
         <w:rPr>
@@ -1154,82 +1762,6 @@
           <w:szCs w:val="24"/>
         </w:rPr>
         <w:t xml:space="preserve">. </w:t>
-      </w:r>
-      <w:proofErr w:type="spellStart"/>
-      <w:r>
-        <w:rPr>
-          <w:rFonts w:ascii="Times New Roman" w:hAnsi="Times New Roman" w:cs="Times New Roman"/>
-          <w:bCs/>
-          <w:sz w:val="24"/>
-          <w:szCs w:val="24"/>
-        </w:rPr>
-        <w:t>NeurIPS</w:t>
-      </w:r>
-      <w:proofErr w:type="spellEnd"/>
-      <w:r>
-        <w:rPr>
-          <w:rFonts w:ascii="Times New Roman" w:hAnsi="Times New Roman" w:cs="Times New Roman"/>
-          <w:bCs/>
-          <w:sz w:val="24"/>
-          <w:szCs w:val="24"/>
-        </w:rPr>
-        <w:t xml:space="preserve"> 2025</w:t>
-      </w:r>
-    </w:p>
-    <w:p>
-      <w:pPr>
-        <w:autoSpaceDE w:val="0"/>
-        <w:autoSpaceDN w:val="0"/>
-        <w:adjustRightInd w:val="0"/>
-        <w:spacing w:after="0" w:line="240" w:lineRule="auto"/>
-        <w:rPr>
-          <w:rFonts w:ascii="Times New Roman" w:hAnsi="Times New Roman" w:cs="Times New Roman"/>
-          <w:bCs/>
-          <w:sz w:val="24"/>
-          <w:szCs w:val="24"/>
-        </w:rPr>
-      </w:pPr>
-    </w:p>
-    <w:p>
-      <w:pPr>
-        <w:autoSpaceDE w:val="0"/>
-        <w:autoSpaceDN w:val="0"/>
-        <w:adjustRightInd w:val="0"/>
-        <w:spacing w:after="0" w:line="240" w:lineRule="auto"/>
-        <w:rPr>
-          <w:rFonts w:ascii="Times New Roman" w:hAnsi="Times New Roman" w:cs="Times New Roman"/>
-          <w:bCs/>
-          <w:sz w:val="24"/>
-          <w:szCs w:val="24"/>
-        </w:rPr>
-      </w:pPr>
-      <w:r>
-        <w:rPr>
-          <w:rFonts w:ascii="Times New Roman" w:hAnsi="Times New Roman" w:cs="Times New Roman"/>
-          <w:bCs/>
-          <w:sz w:val="24"/>
-          <w:szCs w:val="24"/>
-        </w:rPr>
-        <w:t xml:space="preserve">[p] </w:t>
-      </w:r>
-      <w:r>
-        <w:rPr>
-          <w:rFonts w:ascii="Times New Roman" w:hAnsi="Times New Roman" w:cs="Times New Roman"/>
-          <w:bCs/>
-          <w:sz w:val="24"/>
-          <w:szCs w:val="24"/>
-          <w:u w:val="single"/>
-        </w:rPr>
-        <w:t>S. Sadhuka</w:t>
-      </w:r>
-      <w:r>
-        <w:rPr>
-          <w:rFonts w:ascii="Times New Roman" w:hAnsi="Times New Roman" w:cs="Times New Roman"/>
-          <w:bCs/>
-          <w:sz w:val="24"/>
-          <w:szCs w:val="24"/>
-        </w:rPr>
-        <w:t xml:space="preserve">, S. Lin, B. Berger**. E. Pierson**. </w:t>
       </w:r>
       <w:r>
         <w:rPr>
@@ -1240,7 +1772,81 @@
           <w:sz w:val="24"/>
           <w:szCs w:val="24"/>
         </w:rPr>
-        <w:t>A Bayesian Model for Multi-stage Censoring</w:t>
+        <w:t xml:space="preserve">Annual Reviews in Biomedical Data Science </w:t>
+      </w:r>
+      <w:r>
+        <w:rPr>
+          <w:rFonts w:ascii="Times New Roman" w:hAnsi="Times New Roman" w:cs="Times New Roman"/>
+          <w:bCs/>
+          <w:sz w:val="24"/>
+          <w:szCs w:val="24"/>
+        </w:rPr>
+        <w:t>2024</w:t>
+      </w:r>
+    </w:p>
+    <w:p>
+      <w:pPr>
+        <w:autoSpaceDE w:val="0"/>
+        <w:autoSpaceDN w:val="0"/>
+        <w:adjustRightInd w:val="0"/>
+        <w:spacing w:after="0" w:line="240" w:lineRule="auto"/>
+        <w:rPr>
+          <w:rFonts w:ascii="Times New Roman" w:hAnsi="Times New Roman" w:cs="Times New Roman"/>
+          <w:bCs/>
+          <w:sz w:val="24"/>
+          <w:szCs w:val="24"/>
+        </w:rPr>
+      </w:pPr>
+    </w:p>
+    <w:p>
+      <w:pPr>
+        <w:autoSpaceDE w:val="0"/>
+        <w:autoSpaceDN w:val="0"/>
+        <w:adjustRightInd w:val="0"/>
+        <w:spacing w:after="0" w:line="240" w:lineRule="auto"/>
+        <w:rPr>
+          <w:rFonts w:ascii="Times New Roman" w:hAnsi="Times New Roman" w:cs="Times New Roman"/>
+          <w:bCs/>
+          <w:sz w:val="24"/>
+          <w:szCs w:val="24"/>
+        </w:rPr>
+      </w:pPr>
+      <w:r>
+        <w:rPr>
+          <w:rFonts w:ascii="Times New Roman" w:hAnsi="Times New Roman" w:cs="Times New Roman"/>
+          <w:bCs/>
+          <w:sz w:val="24"/>
+          <w:szCs w:val="24"/>
+        </w:rPr>
+        <w:t xml:space="preserve">[p] </w:t>
+      </w:r>
+      <w:r>
+        <w:rPr>
+          <w:rFonts w:ascii="Times New Roman" w:hAnsi="Times New Roman" w:cs="Times New Roman"/>
+          <w:bCs/>
+          <w:sz w:val="24"/>
+          <w:szCs w:val="24"/>
+          <w:u w:val="single"/>
+        </w:rPr>
+        <w:t>S. Sadhuka</w:t>
+      </w:r>
+      <w:r>
+        <w:rPr>
+          <w:rFonts w:ascii="Times New Roman" w:hAnsi="Times New Roman" w:cs="Times New Roman"/>
+          <w:bCs/>
+          <w:sz w:val="24"/>
+          <w:szCs w:val="24"/>
+        </w:rPr>
+        <w:t xml:space="preserve">, D. Fridman, </w:t>
+      </w:r>
+      <w:r>
+        <w:rPr>
+          <w:rFonts w:ascii="Times New Roman" w:hAnsi="Times New Roman" w:cs="Times New Roman"/>
+          <w:bCs/>
+          <w:sz w:val="24"/>
+          <w:szCs w:val="24"/>
+        </w:rPr>
+        <w:t>B. Berger, H. Cho</w:t>
       </w:r>
       <w:r>
         <w:rPr>
@@ -1250,69 +1856,6 @@
           <w:szCs w:val="24"/>
         </w:rPr>
         <w:t xml:space="preserve">. </w:t>
-      </w:r>
-      <w:r>
-        <w:rPr>
-          <w:rFonts w:ascii="Times New Roman" w:hAnsi="Times New Roman" w:cs="Times New Roman"/>
-          <w:bCs/>
-          <w:sz w:val="24"/>
-          <w:szCs w:val="24"/>
-        </w:rPr>
-        <w:t>ML4H 2025</w:t>
-      </w:r>
-      <w:r>
-        <w:rPr>
-          <w:rFonts w:ascii="Times New Roman" w:hAnsi="Times New Roman" w:cs="Times New Roman"/>
-          <w:bCs/>
-          <w:sz w:val="24"/>
-          <w:szCs w:val="24"/>
-        </w:rPr>
-        <w:t xml:space="preserve"> (proceedings</w:t>
-      </w:r>
-      <w:r>
-        <w:rPr>
-          <w:rFonts w:ascii="Times New Roman" w:hAnsi="Times New Roman" w:cs="Times New Roman"/>
-          <w:bCs/>
-          <w:sz w:val="24"/>
-          <w:szCs w:val="24"/>
-        </w:rPr>
-        <w:t xml:space="preserve"> track</w:t>
-      </w:r>
-      <w:r>
-        <w:rPr>
-          <w:rFonts w:ascii="Times New Roman" w:hAnsi="Times New Roman" w:cs="Times New Roman"/>
-          <w:bCs/>
-          <w:sz w:val="24"/>
-          <w:szCs w:val="24"/>
-        </w:rPr>
-        <w:t>)</w:t>
-      </w:r>
-      <w:r>
-        <w:rPr>
-          <w:rFonts w:ascii="Times New Roman" w:hAnsi="Times New Roman" w:cs="Times New Roman"/>
-          <w:bCs/>
-          <w:sz w:val="24"/>
-          <w:szCs w:val="24"/>
-        </w:rPr>
-        <w:t xml:space="preserve">, also </w:t>
-      </w:r>
-      <w:r>
-        <w:rPr>
-          <w:rFonts w:ascii="Times New Roman" w:hAnsi="Times New Roman" w:cs="Times New Roman"/>
-          <w:b/>
-          <w:sz w:val="24"/>
-          <w:szCs w:val="24"/>
-        </w:rPr>
-        <w:t xml:space="preserve">spotlight presentation at </w:t>
-      </w:r>
-      <w:r>
-        <w:rPr>
-          <w:rFonts w:ascii="Times New Roman" w:hAnsi="Times New Roman" w:cs="Times New Roman"/>
-          <w:bCs/>
-          <w:sz w:val="24"/>
-          <w:szCs w:val="24"/>
-        </w:rPr>
-        <w:t>ML4H</w:t>
       </w:r>
       <w:r>
         <w:rPr>
@@ -1323,110 +1866,7 @@
           <w:sz w:val="24"/>
           <w:szCs w:val="24"/>
         </w:rPr>
-        <w:t xml:space="preserve"> </w:t>
-      </w:r>
-      <w:r>
-        <w:rPr>
-          <w:rFonts w:ascii="Times New Roman" w:hAnsi="Times New Roman" w:cs="Times New Roman"/>
-          <w:bCs/>
-          <w:sz w:val="24"/>
-          <w:szCs w:val="24"/>
-        </w:rPr>
-        <w:t>2024 (findings track)</w:t>
-      </w:r>
-    </w:p>
-    <w:p>
-      <w:pPr>
-        <w:autoSpaceDE w:val="0"/>
-        <w:autoSpaceDN w:val="0"/>
-        <w:adjustRightInd w:val="0"/>
-        <w:spacing w:after="0" w:line="240" w:lineRule="auto"/>
-        <w:rPr>
-          <w:rFonts w:ascii="Times New Roman" w:hAnsi="Times New Roman" w:cs="Times New Roman"/>
-          <w:bCs/>
-          <w:sz w:val="24"/>
-          <w:szCs w:val="24"/>
-        </w:rPr>
-      </w:pPr>
-    </w:p>
-    <w:p>
-      <w:pPr>
-        <w:autoSpaceDE w:val="0"/>
-        <w:autoSpaceDN w:val="0"/>
-        <w:adjustRightInd w:val="0"/>
-        <w:spacing w:after="0" w:line="240" w:lineRule="auto"/>
-        <w:rPr>
-          <w:rFonts w:ascii="Times New Roman" w:hAnsi="Times New Roman" w:cs="Times New Roman"/>
-          <w:bCs/>
-          <w:sz w:val="24"/>
-          <w:szCs w:val="24"/>
-        </w:rPr>
-      </w:pPr>
-      <w:r>
-        <w:rPr>
-          <w:rFonts w:ascii="Times New Roman" w:hAnsi="Times New Roman" w:cs="Times New Roman"/>
-          <w:bCs/>
-          <w:sz w:val="24"/>
-          <w:szCs w:val="24"/>
-        </w:rPr>
-        <w:t xml:space="preserve">[p] </w:t>
-      </w:r>
-      <w:r>
-        <w:rPr>
-          <w:rFonts w:ascii="Times New Roman" w:hAnsi="Times New Roman" w:cs="Times New Roman"/>
-          <w:bCs/>
-          <w:sz w:val="24"/>
-          <w:szCs w:val="24"/>
-        </w:rPr>
-        <w:t xml:space="preserve">H. Cho, D. Froelicher*, N. </w:t>
-      </w:r>
-      <w:proofErr w:type="spellStart"/>
-      <w:r>
-        <w:rPr>
-          <w:rFonts w:ascii="Times New Roman" w:hAnsi="Times New Roman" w:cs="Times New Roman"/>
-          <w:bCs/>
-          <w:sz w:val="24"/>
-          <w:szCs w:val="24"/>
-        </w:rPr>
-        <w:t>Dokmai</w:t>
-      </w:r>
-      <w:proofErr w:type="spellEnd"/>
-      <w:r>
-        <w:rPr>
-          <w:rFonts w:ascii="Times New Roman" w:hAnsi="Times New Roman" w:cs="Times New Roman"/>
-          <w:bCs/>
-          <w:sz w:val="24"/>
-          <w:szCs w:val="24"/>
-        </w:rPr>
-        <w:t xml:space="preserve">*, A. Nandi*, </w:t>
-      </w:r>
-      <w:r>
-        <w:rPr>
-          <w:rFonts w:ascii="Times New Roman" w:hAnsi="Times New Roman" w:cs="Times New Roman"/>
-          <w:bCs/>
-          <w:sz w:val="24"/>
-          <w:szCs w:val="24"/>
-          <w:u w:val="single"/>
-        </w:rPr>
-        <w:t>S. Sadhuka</w:t>
-      </w:r>
-      <w:r>
-        <w:rPr>
-          <w:rFonts w:ascii="Times New Roman" w:hAnsi="Times New Roman" w:cs="Times New Roman"/>
-          <w:bCs/>
-          <w:sz w:val="24"/>
-          <w:szCs w:val="24"/>
-        </w:rPr>
-        <w:t xml:space="preserve">*, </w:t>
-      </w:r>
-      <w:r>
-        <w:rPr>
-          <w:rFonts w:ascii="Times New Roman" w:hAnsi="Times New Roman" w:cs="Times New Roman"/>
-          <w:bCs/>
-          <w:sz w:val="24"/>
-          <w:szCs w:val="24"/>
-        </w:rPr>
-        <w:t>M. Hong*, B. Berger</w:t>
+        <w:t>Assessing transcriptomic reidentification risks using discriminative sequence models</w:t>
       </w:r>
       <w:r>
         <w:rPr>
@@ -1446,16 +1886,70 @@
           <w:sz w:val="24"/>
           <w:szCs w:val="24"/>
         </w:rPr>
-        <w:t>Privacy-Enhancing Technologies in Biomedical Data Science</w:t>
-      </w:r>
-      <w:r>
-        <w:rPr>
-          <w:rFonts w:ascii="Times New Roman" w:hAnsi="Times New Roman" w:cs="Times New Roman"/>
-          <w:bCs/>
-          <w:sz w:val="24"/>
-          <w:szCs w:val="24"/>
-        </w:rPr>
-        <w:t xml:space="preserve">. </w:t>
+        <w:t>Genome Research</w:t>
+      </w:r>
+      <w:r>
+        <w:rPr>
+          <w:rFonts w:ascii="Times New Roman" w:hAnsi="Times New Roman" w:cs="Times New Roman"/>
+          <w:bCs/>
+          <w:sz w:val="24"/>
+          <w:szCs w:val="24"/>
+        </w:rPr>
+        <w:t xml:space="preserve"> 2023</w:t>
+      </w:r>
+      <w:r>
+        <w:rPr>
+          <w:rFonts w:ascii="Times New Roman" w:hAnsi="Times New Roman" w:cs="Times New Roman"/>
+          <w:bCs/>
+          <w:sz w:val="24"/>
+          <w:szCs w:val="24"/>
+        </w:rPr>
+        <w:t xml:space="preserve">; </w:t>
+      </w:r>
+      <w:r>
+        <w:rPr>
+          <w:rFonts w:ascii="Times New Roman" w:hAnsi="Times New Roman" w:cs="Times New Roman"/>
+          <w:b/>
+          <w:sz w:val="24"/>
+          <w:szCs w:val="24"/>
+        </w:rPr>
+        <w:t>oral presentation</w:t>
+      </w:r>
+      <w:r>
+        <w:rPr>
+          <w:rFonts w:ascii="Times New Roman" w:hAnsi="Times New Roman" w:cs="Times New Roman"/>
+          <w:bCs/>
+          <w:sz w:val="24"/>
+          <w:szCs w:val="24"/>
+        </w:rPr>
+        <w:t xml:space="preserve"> </w:t>
+      </w:r>
+      <w:r>
+        <w:rPr>
+          <w:rFonts w:ascii="Times New Roman" w:hAnsi="Times New Roman" w:cs="Times New Roman"/>
+          <w:b/>
+          <w:sz w:val="24"/>
+          <w:szCs w:val="24"/>
+        </w:rPr>
+        <w:t>at</w:t>
+      </w:r>
+      <w:r>
+        <w:rPr>
+          <w:rFonts w:ascii="Times New Roman" w:hAnsi="Times New Roman" w:cs="Times New Roman"/>
+          <w:b/>
+          <w:sz w:val="24"/>
+          <w:szCs w:val="24"/>
+        </w:rPr>
+        <w:t xml:space="preserve"> </w:t>
+      </w:r>
+      <w:r>
+        <w:rPr>
+          <w:rFonts w:ascii="Times New Roman" w:hAnsi="Times New Roman" w:cs="Times New Roman"/>
+          <w:bCs/>
+          <w:sz w:val="24"/>
+          <w:szCs w:val="24"/>
+        </w:rPr>
+        <w:t>RECOMB</w:t>
       </w:r>
       <w:r>
         <w:rPr>
@@ -1466,177 +1960,16 @@
           <w:sz w:val="24"/>
           <w:szCs w:val="24"/>
         </w:rPr>
-        <w:t xml:space="preserve">Annual Reviews in Biomedical Data Science </w:t>
-      </w:r>
-      <w:r>
-        <w:rPr>
-          <w:rFonts w:ascii="Times New Roman" w:hAnsi="Times New Roman" w:cs="Times New Roman"/>
-          <w:bCs/>
-          <w:sz w:val="24"/>
-          <w:szCs w:val="24"/>
-        </w:rPr>
-        <w:t>2024</w:t>
-      </w:r>
-    </w:p>
-    <w:p>
-      <w:pPr>
-        <w:autoSpaceDE w:val="0"/>
-        <w:autoSpaceDN w:val="0"/>
-        <w:adjustRightInd w:val="0"/>
-        <w:spacing w:after="0" w:line="240" w:lineRule="auto"/>
-        <w:rPr>
-          <w:rFonts w:ascii="Times New Roman" w:hAnsi="Times New Roman" w:cs="Times New Roman"/>
-          <w:bCs/>
-          <w:sz w:val="24"/>
-          <w:szCs w:val="24"/>
-        </w:rPr>
-      </w:pPr>
-    </w:p>
-    <w:p>
-      <w:pPr>
-        <w:autoSpaceDE w:val="0"/>
-        <w:autoSpaceDN w:val="0"/>
-        <w:adjustRightInd w:val="0"/>
-        <w:spacing w:after="0" w:line="240" w:lineRule="auto"/>
-        <w:rPr>
-          <w:rFonts w:ascii="Times New Roman" w:hAnsi="Times New Roman" w:cs="Times New Roman"/>
-          <w:bCs/>
-          <w:sz w:val="24"/>
-          <w:szCs w:val="24"/>
-        </w:rPr>
-      </w:pPr>
-      <w:r>
-        <w:rPr>
-          <w:rFonts w:ascii="Times New Roman" w:hAnsi="Times New Roman" w:cs="Times New Roman"/>
-          <w:bCs/>
-          <w:sz w:val="24"/>
-          <w:szCs w:val="24"/>
-        </w:rPr>
-        <w:t xml:space="preserve">[p] </w:t>
-      </w:r>
-      <w:r>
-        <w:rPr>
-          <w:rFonts w:ascii="Times New Roman" w:hAnsi="Times New Roman" w:cs="Times New Roman"/>
-          <w:bCs/>
-          <w:sz w:val="24"/>
-          <w:szCs w:val="24"/>
-          <w:u w:val="single"/>
-        </w:rPr>
-        <w:t>S. Sadhuka</w:t>
-      </w:r>
-      <w:r>
-        <w:rPr>
-          <w:rFonts w:ascii="Times New Roman" w:hAnsi="Times New Roman" w:cs="Times New Roman"/>
-          <w:bCs/>
-          <w:sz w:val="24"/>
-          <w:szCs w:val="24"/>
-        </w:rPr>
-        <w:t xml:space="preserve">, D. Fridman, </w:t>
-      </w:r>
-      <w:r>
-        <w:rPr>
-          <w:rFonts w:ascii="Times New Roman" w:hAnsi="Times New Roman" w:cs="Times New Roman"/>
-          <w:bCs/>
-          <w:sz w:val="24"/>
-          <w:szCs w:val="24"/>
-        </w:rPr>
-        <w:t>B. Berger, H. Cho</w:t>
-      </w:r>
-      <w:r>
-        <w:rPr>
-          <w:rFonts w:ascii="Times New Roman" w:hAnsi="Times New Roman" w:cs="Times New Roman"/>
-          <w:bCs/>
-          <w:sz w:val="24"/>
-          <w:szCs w:val="24"/>
-        </w:rPr>
-        <w:t xml:space="preserve">. </w:t>
-      </w:r>
-      <w:r>
-        <w:rPr>
-          <w:rFonts w:ascii="Times New Roman" w:hAnsi="Times New Roman" w:cs="Times New Roman"/>
-          <w:bCs/>
-          <w:i/>
-          <w:iCs/>
-          <w:sz w:val="24"/>
-          <w:szCs w:val="24"/>
-        </w:rPr>
-        <w:t>Assessing transcriptomic reidentification risks using discriminative sequence models</w:t>
-      </w:r>
-      <w:r>
-        <w:rPr>
-          <w:rFonts w:ascii="Times New Roman" w:hAnsi="Times New Roman" w:cs="Times New Roman"/>
-          <w:bCs/>
-          <w:sz w:val="24"/>
-          <w:szCs w:val="24"/>
-        </w:rPr>
-        <w:t xml:space="preserve">. </w:t>
-      </w:r>
-      <w:r>
-        <w:rPr>
-          <w:rFonts w:ascii="Times New Roman" w:hAnsi="Times New Roman" w:cs="Times New Roman"/>
-          <w:bCs/>
-          <w:i/>
-          <w:iCs/>
-          <w:sz w:val="24"/>
-          <w:szCs w:val="24"/>
-        </w:rPr>
-        <w:t>Genome Research</w:t>
-      </w:r>
-      <w:r>
-        <w:rPr>
-          <w:rFonts w:ascii="Times New Roman" w:hAnsi="Times New Roman" w:cs="Times New Roman"/>
-          <w:bCs/>
-          <w:sz w:val="24"/>
-          <w:szCs w:val="24"/>
-        </w:rPr>
-        <w:t xml:space="preserve"> 2023</w:t>
-      </w:r>
-      <w:r>
-        <w:rPr>
-          <w:rFonts w:ascii="Times New Roman" w:hAnsi="Times New Roman" w:cs="Times New Roman"/>
-          <w:bCs/>
-          <w:sz w:val="24"/>
-          <w:szCs w:val="24"/>
-        </w:rPr>
-        <w:t xml:space="preserve">; </w:t>
-      </w:r>
-      <w:r>
-        <w:rPr>
-          <w:rFonts w:ascii="Times New Roman" w:hAnsi="Times New Roman" w:cs="Times New Roman"/>
-          <w:b/>
-          <w:sz w:val="24"/>
-          <w:szCs w:val="24"/>
-        </w:rPr>
-        <w:t>oral presentation</w:t>
-      </w:r>
-      <w:r>
-        <w:rPr>
-          <w:rFonts w:ascii="Times New Roman" w:hAnsi="Times New Roman" w:cs="Times New Roman"/>
-          <w:bCs/>
-          <w:sz w:val="24"/>
-          <w:szCs w:val="24"/>
-        </w:rPr>
         <w:t xml:space="preserve"> </w:t>
       </w:r>
       <w:r>
         <w:rPr>
           <w:rFonts w:ascii="Times New Roman" w:hAnsi="Times New Roman" w:cs="Times New Roman"/>
-          <w:b/>
-          <w:sz w:val="24"/>
-          <w:szCs w:val="24"/>
-        </w:rPr>
-        <w:t xml:space="preserve">at </w:t>
-      </w:r>
-      <w:r>
-        <w:rPr>
-          <w:rFonts w:ascii="Times New Roman" w:hAnsi="Times New Roman" w:cs="Times New Roman"/>
-          <w:bCs/>
-          <w:i/>
-          <w:iCs/>
-          <w:sz w:val="24"/>
-          <w:szCs w:val="24"/>
-        </w:rPr>
-        <w:t>RECOMB 2023</w:t>
+          <w:bCs/>
+          <w:sz w:val="24"/>
+          <w:szCs w:val="24"/>
+        </w:rPr>
+        <w:t>2023</w:t>
       </w:r>
     </w:p>
     <w:p>
@@ -1992,7 +2325,26 @@
           <w:sz w:val="24"/>
           <w:szCs w:val="24"/>
         </w:rPr>
-        <w:t xml:space="preserve">Q. Wang, D. Kelley, J. </w:t>
+        <w:t xml:space="preserve">Q. Wang, D. Kelley, J. Ulrisch, M. Kanai, </w:t>
+      </w:r>
+      <w:r>
+        <w:rPr>
+          <w:rFonts w:ascii="Times New Roman" w:hAnsi="Times New Roman" w:cs="Times New Roman"/>
+          <w:bCs/>
+          <w:sz w:val="24"/>
+          <w:szCs w:val="24"/>
+          <w:u w:val="single"/>
+        </w:rPr>
+        <w:t>S. Sadhuka</w:t>
+      </w:r>
+      <w:r>
+        <w:rPr>
+          <w:rFonts w:ascii="Times New Roman" w:hAnsi="Times New Roman" w:cs="Times New Roman"/>
+          <w:bCs/>
+          <w:sz w:val="24"/>
+          <w:szCs w:val="24"/>
+        </w:rPr>
+        <w:t xml:space="preserve">, R. Cui, C. </w:t>
       </w:r>
       <w:proofErr w:type="spellStart"/>
       <w:r>
@@ -2002,7 +2354,7 @@
           <w:sz w:val="24"/>
           <w:szCs w:val="24"/>
         </w:rPr>
-        <w:t>Ulrisch</w:t>
+        <w:t>Albors</w:t>
       </w:r>
       <w:proofErr w:type="spellEnd"/>
       <w:r>
@@ -2012,86 +2364,7 @@
           <w:sz w:val="24"/>
           <w:szCs w:val="24"/>
         </w:rPr>
-        <w:t xml:space="preserve">, M. Kanai, </w:t>
-      </w:r>
-      <w:r>
-        <w:rPr>
-          <w:rFonts w:ascii="Times New Roman" w:hAnsi="Times New Roman" w:cs="Times New Roman"/>
-          <w:bCs/>
-          <w:sz w:val="24"/>
-          <w:szCs w:val="24"/>
-          <w:u w:val="single"/>
-        </w:rPr>
-        <w:t>S. Sadhuka</w:t>
-      </w:r>
-      <w:r>
-        <w:rPr>
-          <w:rFonts w:ascii="Times New Roman" w:hAnsi="Times New Roman" w:cs="Times New Roman"/>
-          <w:bCs/>
-          <w:sz w:val="24"/>
-          <w:szCs w:val="24"/>
-        </w:rPr>
-        <w:t xml:space="preserve">, R. Cui, C. </w:t>
-      </w:r>
-      <w:proofErr w:type="spellStart"/>
-      <w:r>
-        <w:rPr>
-          <w:rFonts w:ascii="Times New Roman" w:hAnsi="Times New Roman" w:cs="Times New Roman"/>
-          <w:bCs/>
-          <w:sz w:val="24"/>
-          <w:szCs w:val="24"/>
-        </w:rPr>
-        <w:t>Albors</w:t>
-      </w:r>
-      <w:proofErr w:type="spellEnd"/>
-      <w:r>
-        <w:rPr>
-          <w:rFonts w:ascii="Times New Roman" w:hAnsi="Times New Roman" w:cs="Times New Roman"/>
-          <w:bCs/>
-          <w:sz w:val="24"/>
-          <w:szCs w:val="24"/>
-        </w:rPr>
-        <w:t xml:space="preserve">, N. Cheng, Y. Okada, Biobank Japan Project, F. </w:t>
-      </w:r>
-      <w:proofErr w:type="spellStart"/>
-      <w:r>
-        <w:rPr>
-          <w:rFonts w:ascii="Times New Roman" w:hAnsi="Times New Roman" w:cs="Times New Roman"/>
-          <w:bCs/>
-          <w:sz w:val="24"/>
-          <w:szCs w:val="24"/>
-        </w:rPr>
-        <w:t>Aguet</w:t>
-      </w:r>
-      <w:proofErr w:type="spellEnd"/>
-      <w:r>
-        <w:rPr>
-          <w:rFonts w:ascii="Times New Roman" w:hAnsi="Times New Roman" w:cs="Times New Roman"/>
-          <w:bCs/>
-          <w:sz w:val="24"/>
-          <w:szCs w:val="24"/>
-        </w:rPr>
-        <w:t xml:space="preserve">, K. </w:t>
-      </w:r>
-      <w:proofErr w:type="spellStart"/>
-      <w:r>
-        <w:rPr>
-          <w:rFonts w:ascii="Times New Roman" w:hAnsi="Times New Roman" w:cs="Times New Roman"/>
-          <w:bCs/>
-          <w:sz w:val="24"/>
-          <w:szCs w:val="24"/>
-        </w:rPr>
-        <w:t>Ardlie</w:t>
-      </w:r>
-      <w:proofErr w:type="spellEnd"/>
-      <w:r>
-        <w:rPr>
-          <w:rFonts w:ascii="Times New Roman" w:hAnsi="Times New Roman" w:cs="Times New Roman"/>
-          <w:bCs/>
-          <w:sz w:val="24"/>
-          <w:szCs w:val="24"/>
-        </w:rPr>
-        <w:t xml:space="preserve">, D. MacArthur, H. Finucane. </w:t>
+        <w:t xml:space="preserve">, N. Cheng, Y. Okada, Biobank Japan Project, F. Aguet, K. Ardlie, D. MacArthur, H. Finucane. </w:t>
       </w:r>
       <w:r>
         <w:rPr>
@@ -2160,187 +2433,6 @@
           <w:szCs w:val="24"/>
         </w:rPr>
         <w:t xml:space="preserve"> 2021</w:t>
-      </w:r>
-    </w:p>
-    <w:p>
-      <w:pPr>
-        <w:pBdr>
-          <w:bottom w:val="single" w:sz="4" w:space="1" w:color="auto"/>
-        </w:pBdr>
-        <w:spacing w:after="60"/>
-        <w:rPr>
-          <w:rFonts w:ascii="Times New Roman" w:hAnsi="Times New Roman" w:cs="Times New Roman"/>
-          <w:b/>
-          <w:sz w:val="24"/>
-          <w:szCs w:val="24"/>
-        </w:rPr>
-      </w:pPr>
-    </w:p>
-    <w:p>
-      <w:pPr>
-        <w:pBdr>
-          <w:bottom w:val="single" w:sz="4" w:space="1" w:color="auto"/>
-        </w:pBdr>
-        <w:spacing w:after="60"/>
-        <w:rPr>
-          <w:rFonts w:ascii="Times New Roman" w:hAnsi="Times New Roman" w:cs="Times New Roman"/>
-          <w:b/>
-          <w:sz w:val="24"/>
-          <w:szCs w:val="24"/>
-        </w:rPr>
-      </w:pPr>
-      <w:r>
-        <w:rPr>
-          <w:rFonts w:ascii="Times New Roman" w:hAnsi="Times New Roman" w:cs="Times New Roman"/>
-          <w:b/>
-          <w:sz w:val="24"/>
-          <w:szCs w:val="24"/>
-        </w:rPr>
-        <w:t xml:space="preserve">SELECTED </w:t>
-      </w:r>
-      <w:r>
-        <w:rPr>
-          <w:rFonts w:ascii="Times New Roman" w:hAnsi="Times New Roman" w:cs="Times New Roman"/>
-          <w:b/>
-          <w:sz w:val="24"/>
-          <w:szCs w:val="24"/>
-        </w:rPr>
-        <w:t xml:space="preserve">HONORS &amp; AWARDS </w:t>
-      </w:r>
-    </w:p>
-    <w:p>
-      <w:pPr>
-        <w:tabs>
-          <w:tab w:val="right" w:pos="9360"/>
-        </w:tabs>
-        <w:autoSpaceDE w:val="0"/>
-        <w:autoSpaceDN w:val="0"/>
-        <w:adjustRightInd w:val="0"/>
-        <w:spacing w:after="0" w:line="240" w:lineRule="auto"/>
-        <w:rPr>
-          <w:rFonts w:ascii="Times New Roman" w:hAnsi="Times New Roman" w:cs="Times New Roman"/>
-          <w:sz w:val="24"/>
-          <w:szCs w:val="24"/>
-        </w:rPr>
-      </w:pPr>
-      <w:r>
-        <w:rPr>
-          <w:rFonts w:ascii="Times New Roman" w:hAnsi="Times New Roman" w:cs="Times New Roman"/>
-          <w:sz w:val="24"/>
-          <w:szCs w:val="24"/>
-        </w:rPr>
-        <w:t>MIT Envisioning the Future of Computing Essay, Honorable Mention</w:t>
-      </w:r>
-      <w:r>
-        <w:rPr>
-          <w:rFonts w:ascii="Times New Roman" w:hAnsi="Times New Roman" w:cs="Times New Roman"/>
-          <w:sz w:val="24"/>
-          <w:szCs w:val="24"/>
-        </w:rPr>
-        <w:tab/>
-        <w:t>2023</w:t>
-      </w:r>
-    </w:p>
-    <w:p>
-      <w:pPr>
-        <w:tabs>
-          <w:tab w:val="right" w:pos="9360"/>
-        </w:tabs>
-        <w:autoSpaceDE w:val="0"/>
-        <w:autoSpaceDN w:val="0"/>
-        <w:adjustRightInd w:val="0"/>
-        <w:spacing w:after="0" w:line="240" w:lineRule="auto"/>
-        <w:rPr>
-          <w:rFonts w:ascii="Times New Roman" w:hAnsi="Times New Roman" w:cs="Times New Roman"/>
-          <w:iCs/>
-          <w:sz w:val="24"/>
-          <w:szCs w:val="24"/>
-        </w:rPr>
-      </w:pPr>
-      <w:r>
-        <w:rPr>
-          <w:rFonts w:ascii="Times New Roman" w:hAnsi="Times New Roman" w:cs="Times New Roman"/>
-          <w:sz w:val="24"/>
-          <w:szCs w:val="24"/>
-        </w:rPr>
-        <w:t>National Science Foundation Graduate Research Fellowship</w:t>
-      </w:r>
-      <w:r>
-        <w:rPr>
-          <w:rFonts w:ascii="Times New Roman" w:hAnsi="Times New Roman" w:cs="Times New Roman"/>
-          <w:sz w:val="24"/>
-          <w:szCs w:val="24"/>
-        </w:rPr>
-        <w:tab/>
-      </w:r>
-      <w:r>
-        <w:rPr>
-          <w:rFonts w:ascii="Times New Roman" w:hAnsi="Times New Roman" w:cs="Times New Roman"/>
-          <w:iCs/>
-          <w:sz w:val="24"/>
-          <w:szCs w:val="24"/>
-        </w:rPr>
-        <w:t>20</w:t>
-      </w:r>
-      <w:r>
-        <w:rPr>
-          <w:rFonts w:ascii="Times New Roman" w:hAnsi="Times New Roman" w:cs="Times New Roman"/>
-          <w:iCs/>
-          <w:sz w:val="24"/>
-          <w:szCs w:val="24"/>
-        </w:rPr>
-        <w:t>22</w:t>
-      </w:r>
-    </w:p>
-    <w:p>
-      <w:pPr>
-        <w:tabs>
-          <w:tab w:val="right" w:pos="9360"/>
-        </w:tabs>
-        <w:autoSpaceDE w:val="0"/>
-        <w:autoSpaceDN w:val="0"/>
-        <w:adjustRightInd w:val="0"/>
-        <w:spacing w:after="0" w:line="240" w:lineRule="auto"/>
-        <w:rPr>
-          <w:rFonts w:ascii="Times New Roman" w:hAnsi="Times New Roman" w:cs="Times New Roman"/>
-          <w:iCs/>
-          <w:sz w:val="24"/>
-          <w:szCs w:val="24"/>
-        </w:rPr>
-      </w:pPr>
-      <w:r>
-        <w:rPr>
-          <w:rFonts w:ascii="Times New Roman" w:hAnsi="Times New Roman" w:cs="Times New Roman"/>
-          <w:sz w:val="24"/>
-          <w:szCs w:val="24"/>
-        </w:rPr>
-        <w:t>Hertz Foundation Fellowship</w:t>
-      </w:r>
-      <w:r>
-        <w:rPr>
-          <w:rFonts w:ascii="Times New Roman" w:hAnsi="Times New Roman" w:cs="Times New Roman"/>
-          <w:sz w:val="24"/>
-          <w:szCs w:val="24"/>
-        </w:rPr>
-        <w:tab/>
-      </w:r>
-      <w:r>
-        <w:rPr>
-          <w:rFonts w:ascii="Times New Roman" w:hAnsi="Times New Roman" w:cs="Times New Roman"/>
-          <w:iCs/>
-          <w:sz w:val="24"/>
-          <w:szCs w:val="24"/>
-        </w:rPr>
-        <w:t>20</w:t>
-      </w:r>
-      <w:r>
-        <w:rPr>
-          <w:rFonts w:ascii="Times New Roman" w:hAnsi="Times New Roman" w:cs="Times New Roman"/>
-          <w:iCs/>
-          <w:sz w:val="24"/>
-          <w:szCs w:val="24"/>
-        </w:rPr>
-        <w:t>22</w:t>
       </w:r>
     </w:p>
     <w:p>
@@ -3047,25 +3139,7 @@
           <w:sz w:val="24"/>
           <w:szCs w:val="24"/>
         </w:rPr>
-        <w:t xml:space="preserve">(Prof. Michael </w:t>
-      </w:r>
-      <w:proofErr w:type="spellStart"/>
-      <w:r>
-        <w:rPr>
-          <w:rFonts w:ascii="Times New Roman" w:hAnsi="Times New Roman" w:cs="Times New Roman"/>
-          <w:sz w:val="24"/>
-          <w:szCs w:val="24"/>
-        </w:rPr>
-        <w:t>Mitzenmacher</w:t>
-      </w:r>
-      <w:proofErr w:type="spellEnd"/>
-      <w:r>
-        <w:rPr>
-          <w:rFonts w:ascii="Times New Roman" w:hAnsi="Times New Roman" w:cs="Times New Roman"/>
-          <w:sz w:val="24"/>
-          <w:szCs w:val="24"/>
-        </w:rPr>
-        <w:t>)</w:t>
+        <w:t>(Prof. Michael Mitzenmacher)</w:t>
       </w:r>
       <w:r>
         <w:rPr>
@@ -3376,6 +3450,7 @@
           <w:sz w:val="24"/>
           <w:szCs w:val="24"/>
         </w:rPr>
+        <w:lastRenderedPageBreak/>
         <w:t>Member, NIST AI Safety Institute Task Force on Red Teaming                                              2024</w:t>
       </w:r>
     </w:p>
@@ -3468,6 +3543,20 @@
         </w:rPr>
         <w:t>PNAS</w:t>
       </w:r>
+    </w:p>
+    <w:p>
+      <w:pPr>
+        <w:pBdr>
+          <w:bottom w:val="single" w:sz="4" w:space="1" w:color="auto"/>
+        </w:pBdr>
+        <w:spacing w:after="60"/>
+        <w:rPr>
+          <w:rFonts w:ascii="Times New Roman" w:hAnsi="Times New Roman" w:cs="Times New Roman"/>
+          <w:b/>
+          <w:sz w:val="24"/>
+          <w:szCs w:val="24"/>
+        </w:rPr>
+      </w:pPr>
     </w:p>
     <w:p>
       <w:pPr>
@@ -3653,7 +3742,6 @@
           <w:sz w:val="24"/>
           <w:szCs w:val="24"/>
         </w:rPr>
-        <w:lastRenderedPageBreak/>
         <w:t>Non-Resident Tutor, Mather House (Harvard University)</w:t>
       </w:r>
       <w:r>
@@ -3947,6 +4035,15 @@
           <w:sz w:val="24"/>
           <w:szCs w:val="24"/>
         </w:rPr>
+        <w:t xml:space="preserve"> AI</w:t>
+      </w:r>
+      <w:r>
+        <w:rPr>
+          <w:rFonts w:ascii="Times New Roman" w:hAnsi="Times New Roman" w:cs="Times New Roman"/>
+          <w:b/>
+          <w:sz w:val="24"/>
+          <w:szCs w:val="24"/>
+        </w:rPr>
         <w:tab/>
       </w:r>
       <w:r>
@@ -4030,27 +4127,7 @@
           <w:sz w:val="24"/>
           <w:szCs w:val="24"/>
         </w:rPr>
-        <w:t xml:space="preserve">Mentors: Alex </w:t>
-      </w:r>
-      <w:proofErr w:type="spellStart"/>
-      <w:r>
-        <w:rPr>
-          <w:rFonts w:ascii="Times New Roman" w:hAnsi="Times New Roman" w:cs="Times New Roman"/>
-          <w:bCs/>
-          <w:sz w:val="24"/>
-          <w:szCs w:val="24"/>
-        </w:rPr>
-        <w:t>Chouldechova</w:t>
-      </w:r>
-      <w:proofErr w:type="spellEnd"/>
-      <w:r>
-        <w:rPr>
-          <w:rFonts w:ascii="Times New Roman" w:hAnsi="Times New Roman" w:cs="Times New Roman"/>
-          <w:bCs/>
-          <w:sz w:val="24"/>
-          <w:szCs w:val="24"/>
-        </w:rPr>
-        <w:t>, Michael Oberst</w:t>
+        <w:t>Mentors: Alex Chouldechova, Michael Oberst</w:t>
       </w:r>
     </w:p>
     <w:p>
@@ -4208,68 +4285,6 @@
           <w:szCs w:val="24"/>
         </w:rPr>
         <w:t xml:space="preserve"> Wang, Aviv Regev</w:t>
-      </w:r>
-    </w:p>
-    <w:p>
-      <w:pPr>
-        <w:tabs>
-          <w:tab w:val="right" w:pos="9360"/>
-        </w:tabs>
-        <w:autoSpaceDE w:val="0"/>
-        <w:autoSpaceDN w:val="0"/>
-        <w:adjustRightInd w:val="0"/>
-        <w:spacing w:after="0" w:line="240" w:lineRule="auto"/>
-        <w:rPr>
-          <w:rFonts w:ascii="Times New Roman" w:hAnsi="Times New Roman" w:cs="Times New Roman"/>
-          <w:bCs/>
-          <w:sz w:val="24"/>
-          <w:szCs w:val="24"/>
-        </w:rPr>
-      </w:pPr>
-      <w:r>
-        <w:rPr>
-          <w:rFonts w:ascii="Times New Roman" w:hAnsi="Times New Roman" w:cs="Times New Roman"/>
-          <w:bCs/>
-          <w:sz w:val="24"/>
-          <w:szCs w:val="24"/>
-        </w:rPr>
-        <w:t>Work</w:t>
-      </w:r>
-      <w:r>
-        <w:rPr>
-          <w:rFonts w:ascii="Times New Roman" w:hAnsi="Times New Roman" w:cs="Times New Roman"/>
-          <w:bCs/>
-          <w:sz w:val="24"/>
-          <w:szCs w:val="24"/>
-        </w:rPr>
-        <w:t>ed</w:t>
-      </w:r>
-      <w:r>
-        <w:rPr>
-          <w:rFonts w:ascii="Times New Roman" w:hAnsi="Times New Roman" w:cs="Times New Roman"/>
-          <w:bCs/>
-          <w:sz w:val="24"/>
-          <w:szCs w:val="24"/>
-        </w:rPr>
-        <w:t xml:space="preserve"> on statistical methods for monitoring</w:t>
-      </w:r>
-      <w:r>
-        <w:rPr>
-          <w:rFonts w:ascii="Times New Roman" w:hAnsi="Times New Roman" w:cs="Times New Roman"/>
-          <w:bCs/>
-          <w:sz w:val="24"/>
-          <w:szCs w:val="24"/>
-        </w:rPr>
-        <w:t xml:space="preserve"> scientific</w:t>
-      </w:r>
-      <w:r>
-        <w:rPr>
-          <w:rFonts w:ascii="Times New Roman" w:hAnsi="Times New Roman" w:cs="Times New Roman"/>
-          <w:bCs/>
-          <w:sz w:val="24"/>
-          <w:szCs w:val="24"/>
-        </w:rPr>
-        <w:t xml:space="preserve"> LLM agents.</w:t>
       </w:r>
     </w:p>
     <w:p>
@@ -4551,63 +4566,78 @@
           <w:szCs w:val="24"/>
         </w:rPr>
       </w:pPr>
-      <w:r>
-        <w:rPr>
-          <w:rFonts w:ascii="Times New Roman" w:hAnsi="Times New Roman" w:cs="Times New Roman"/>
-          <w:sz w:val="24"/>
-          <w:szCs w:val="24"/>
-        </w:rPr>
-        <w:t>Aviv Regev</w:t>
-      </w:r>
-    </w:p>
-    <w:p>
-      <w:pPr>
-        <w:autoSpaceDE w:val="0"/>
-        <w:autoSpaceDN w:val="0"/>
-        <w:adjustRightInd w:val="0"/>
-        <w:spacing w:after="0" w:line="240" w:lineRule="auto"/>
-        <w:rPr>
-          <w:rFonts w:ascii="Times New Roman" w:hAnsi="Times New Roman" w:cs="Times New Roman"/>
-          <w:sz w:val="24"/>
-          <w:szCs w:val="24"/>
-        </w:rPr>
-      </w:pPr>
-      <w:r>
-        <w:rPr>
-          <w:rFonts w:ascii="Times New Roman" w:hAnsi="Times New Roman" w:cs="Times New Roman"/>
-          <w:sz w:val="24"/>
-          <w:szCs w:val="24"/>
-        </w:rPr>
-        <w:t>Genentech</w:t>
-      </w:r>
-    </w:p>
-    <w:p>
-      <w:pPr>
-        <w:autoSpaceDE w:val="0"/>
-        <w:autoSpaceDN w:val="0"/>
-        <w:adjustRightInd w:val="0"/>
-        <w:spacing w:after="0" w:line="240" w:lineRule="auto"/>
-        <w:rPr>
-          <w:rFonts w:ascii="Times New Roman" w:hAnsi="Times New Roman" w:cs="Times New Roman"/>
-          <w:sz w:val="24"/>
-          <w:szCs w:val="24"/>
-        </w:rPr>
-      </w:pPr>
-      <w:r>
-        <w:rPr>
-          <w:rFonts w:ascii="Times New Roman" w:hAnsi="Times New Roman" w:cs="Times New Roman"/>
-          <w:sz w:val="24"/>
-          <w:szCs w:val="24"/>
-        </w:rPr>
-        <w:t>Executive Vice President of Research and Early Development</w:t>
-      </w:r>
-    </w:p>
-    <w:p>
-      <w:pPr>
-        <w:autoSpaceDE w:val="0"/>
-        <w:autoSpaceDN w:val="0"/>
-        <w:adjustRightInd w:val="0"/>
-        <w:spacing w:after="0" w:line="240" w:lineRule="auto"/>
+      <w:proofErr w:type="spellStart"/>
+      <w:r>
+        <w:rPr>
+          <w:rFonts w:ascii="Times New Roman" w:hAnsi="Times New Roman" w:cs="Times New Roman"/>
+          <w:sz w:val="24"/>
+          <w:szCs w:val="24"/>
+        </w:rPr>
+        <w:t>Hanchen</w:t>
+      </w:r>
+      <w:proofErr w:type="spellEnd"/>
+      <w:r>
+        <w:rPr>
+          <w:rFonts w:ascii="Times New Roman" w:hAnsi="Times New Roman" w:cs="Times New Roman"/>
+          <w:sz w:val="24"/>
+          <w:szCs w:val="24"/>
+        </w:rPr>
+        <w:t xml:space="preserve"> Wang</w:t>
+      </w:r>
+    </w:p>
+    <w:p>
+      <w:pPr>
+        <w:autoSpaceDE w:val="0"/>
+        <w:autoSpaceDN w:val="0"/>
+        <w:adjustRightInd w:val="0"/>
+        <w:spacing w:after="0" w:line="240" w:lineRule="auto"/>
+        <w:rPr>
+          <w:rFonts w:ascii="Times New Roman" w:hAnsi="Times New Roman" w:cs="Times New Roman"/>
+          <w:sz w:val="24"/>
+          <w:szCs w:val="24"/>
+        </w:rPr>
+      </w:pPr>
+      <w:r>
+        <w:rPr>
+          <w:rFonts w:ascii="Times New Roman" w:hAnsi="Times New Roman" w:cs="Times New Roman"/>
+          <w:sz w:val="24"/>
+          <w:szCs w:val="24"/>
+        </w:rPr>
+        <w:t>Google DeepMind</w:t>
+      </w:r>
+    </w:p>
+    <w:p>
+      <w:pPr>
+        <w:autoSpaceDE w:val="0"/>
+        <w:autoSpaceDN w:val="0"/>
+        <w:adjustRightInd w:val="0"/>
+        <w:spacing w:after="0" w:line="240" w:lineRule="auto"/>
+        <w:rPr>
+          <w:rFonts w:ascii="Times New Roman" w:hAnsi="Times New Roman" w:cs="Times New Roman"/>
+          <w:sz w:val="24"/>
+          <w:szCs w:val="24"/>
+        </w:rPr>
+      </w:pPr>
+      <w:r>
+        <w:rPr>
+          <w:rFonts w:ascii="Times New Roman" w:hAnsi="Times New Roman" w:cs="Times New Roman"/>
+          <w:sz w:val="24"/>
+          <w:szCs w:val="24"/>
+        </w:rPr>
+        <w:t>Research Scientist</w:t>
+      </w:r>
+    </w:p>
+    <w:p>
+      <w:pPr>
+        <w:autoSpaceDE w:val="0"/>
+        <w:autoSpaceDN w:val="0"/>
+        <w:adjustRightInd w:val="0"/>
+        <w:spacing w:after="0" w:line="240" w:lineRule="auto"/>
+        <w:rPr>
+          <w:rFonts w:ascii="Times New Roman" w:hAnsi="Times New Roman" w:cs="Times New Roman"/>
+          <w:sz w:val="24"/>
+          <w:szCs w:val="24"/>
+        </w:rPr>
       </w:pPr>
       <w:hyperlink r:id="rId16" w:history="1">
         <w:r>
@@ -4617,7 +4647,7 @@
             <w:sz w:val="24"/>
             <w:szCs w:val="24"/>
           </w:rPr>
-          <w:t>regev-letters-d@gene.com</w:t>
+          <w:t>hanchenw@cs.stanford.edu</w:t>
         </w:r>
       </w:hyperlink>
       <w:r>
@@ -4702,6 +4732,7 @@
           <w:sz w:val="24"/>
           <w:szCs w:val="24"/>
         </w:rPr>
+        <w:lastRenderedPageBreak/>
         <w:t>Assistant Professor of Electrical Engineering and Computer Science</w:t>
       </w:r>
     </w:p>
@@ -4736,32 +4767,6 @@
         </w:rPr>
         <w:t xml:space="preserve"> </w:t>
       </w:r>
-    </w:p>
-    <w:p>
-      <w:pPr>
-        <w:autoSpaceDE w:val="0"/>
-        <w:autoSpaceDN w:val="0"/>
-        <w:adjustRightInd w:val="0"/>
-        <w:spacing w:after="0" w:line="240" w:lineRule="auto"/>
-        <w:rPr>
-          <w:rFonts w:ascii="Times New Roman" w:hAnsi="Times New Roman" w:cs="Times New Roman"/>
-          <w:sz w:val="24"/>
-          <w:szCs w:val="24"/>
-        </w:rPr>
-      </w:pPr>
-    </w:p>
-    <w:p>
-      <w:pPr>
-        <w:autoSpaceDE w:val="0"/>
-        <w:autoSpaceDN w:val="0"/>
-        <w:adjustRightInd w:val="0"/>
-        <w:spacing w:after="0" w:line="240" w:lineRule="auto"/>
-        <w:rPr>
-          <w:rFonts w:ascii="Times New Roman" w:hAnsi="Times New Roman" w:cs="Times New Roman"/>
-          <w:sz w:val="24"/>
-          <w:szCs w:val="24"/>
-        </w:rPr>
-      </w:pPr>
     </w:p>
     <w:p>
       <w:pPr>
@@ -4827,7 +4832,7 @@
 </file>
 
 <file path=word/endnotes.xml><?xml version="1.0" encoding="utf-8"?>
-<w:endnotes xmlns:wpc="http://schemas.microsoft.com/office/word/2010/wordprocessingCanvas" xmlns:cx="http://schemas.microsoft.com/office/drawing/2014/chartex" xmlns:cx1="http://schemas.microsoft.com/office/drawing/2015/9/8/chartex" xmlns:cx2="http://schemas.microsoft.com/office/drawing/2015/10/21/chartex" xmlns:cx3="http://schemas.microsoft.com/office/drawing/2016/5/9/chartex" xmlns:cx4="http://schemas.microsoft.com/office/drawing/2016/5/10/chartex" xmlns:cx5="http://schemas.microsoft.com/office/drawing/2016/5/11/chartex" xmlns:cx6="http://schemas.microsoft.com/office/drawing/2016/5/12/chartex" xmlns:cx7="http://schemas.microsoft.com/office/drawing/2016/5/13/chartex" xmlns:cx8="http://schemas.microsoft.com/office/drawing/2016/5/14/chartex" xmlns:mc="http://schemas.openxmlformats.org/markup-compatibility/2006" xmlns:aink="http://schemas.microsoft.com/office/drawing/2016/ink" xmlns:am3d="http://schemas.microsoft.com/office/drawing/2017/model3d" xmlns:o="urn:schemas-microsoft-com:office:office" xmlns:oel="http://schemas.microsoft.com/office/2019/extlst" xmlns:r="http://schemas.openxmlformats.org/officeDocument/2006/relationships" xmlns:m="http://schemas.openxmlformats.org/officeDocument/2006/math" xmlns:v="urn:schemas-microsoft-com:vml" xmlns:wp14="http://schemas.microsoft.com/office/word/2010/wordprocessingDrawing" xmlns:wp="http://schemas.openxmlformats.org/drawingml/2006/wordprocessingDrawing" xmlns:w10="urn:schemas-microsoft-com:office:word" xmlns:w="http://schemas.openxmlformats.org/wordprocessingml/2006/main" xmlns:w14="http://schemas.microsoft.com/office/word/2010/wordml" xmlns:w15="http://schemas.microsoft.com/office/word/2012/wordml" xmlns:w16cex="http://schemas.microsoft.com/office/word/2018/wordml/cex" xmlns:w16cid="http://schemas.microsoft.com/office/word/2016/wordml/cid" xmlns:w16="http://schemas.microsoft.com/office/word/2018/wordml" xmlns:w16du="http://schemas.microsoft.com/office/word/2023/wordml/word16du" xmlns:w16sdtdh="http://schemas.microsoft.com/office/word/2020/wordml/sdtdatahash" xmlns:w16sdtfl="http://schemas.microsoft.com/office/word/2024/wordml/sdtformatlock" xmlns:w16se="http://schemas.microsoft.com/office/word/2015/wordml/symex" xmlns:wpg="http://schemas.microsoft.com/office/word/2010/wordprocessingGroup" xmlns:wpi="http://schemas.microsoft.com/office/word/2010/wordprocessingInk" xmlns:wne="http://schemas.microsoft.com/office/word/2006/wordml" xmlns:wps="http://schemas.microsoft.com/office/word/2010/wordprocessingShape" mc:Ignorable="w14 w15 w16se w16cid w16 w16cex w16sdtdh w16sdtfl w16du wp14">
+<w:endnotes xmlns:wpc="http://schemas.microsoft.com/office/word/2010/wordprocessingCanvas" xmlns:cx="http://schemas.microsoft.com/office/drawing/2014/chartex" xmlns:cx1="http://schemas.microsoft.com/office/drawing/2015/9/8/chartex" xmlns:cx2="http://schemas.microsoft.com/office/drawing/2015/10/21/chartex" xmlns:cx3="http://schemas.microsoft.com/office/drawing/2016/5/9/chartex" xmlns:cx4="http://schemas.microsoft.com/office/drawing/2016/5/10/chartex" xmlns:cx5="http://schemas.microsoft.com/office/drawing/2016/5/11/chartex" xmlns:cx6="http://schemas.microsoft.com/office/drawing/2016/5/12/chartex" xmlns:cx7="http://schemas.microsoft.com/office/drawing/2016/5/13/chartex" xmlns:cx8="http://schemas.microsoft.com/office/drawing/2016/5/14/chartex" xmlns:mc="http://schemas.openxmlformats.org/markup-compatibility/2006" xmlns:m="http://schemas.openxmlformats.org/officeDocument/2006/math" xmlns:aink="http://schemas.microsoft.com/office/drawing/2016/ink" xmlns:am3d="http://schemas.microsoft.com/office/drawing/2017/model3d" xmlns:oel="http://schemas.microsoft.com/office/2019/extlst" xmlns:r="http://schemas.openxmlformats.org/officeDocument/2006/relationships" xmlns:wp14="http://schemas.microsoft.com/office/word/2010/wordprocessingDrawing" xmlns:wp="http://schemas.openxmlformats.org/drawingml/2006/wordprocessingDrawing" xmlns:wpg="http://schemas.microsoft.com/office/word/2010/wordprocessingGroup" xmlns:wpi="http://schemas.microsoft.com/office/word/2010/wordprocessingInk" xmlns:wps="http://schemas.microsoft.com/office/word/2010/wordprocessingShape" xmlns:o="urn:schemas-microsoft-com:office:office" xmlns:v="urn:schemas-microsoft-com:vml" xmlns:w10="urn:schemas-microsoft-com:office:word" xmlns:w="http://schemas.openxmlformats.org/wordprocessingml/2006/main" xmlns:w14="http://schemas.microsoft.com/office/word/2010/wordml" xmlns:w15="http://schemas.microsoft.com/office/word/2012/wordml" xmlns:w16cei="http://schemas.microsoft.com/office/word/2026/wordml/cei" xmlns:w16cex="http://schemas.microsoft.com/office/word/2018/wordml/cex" xmlns:w16cid="http://schemas.microsoft.com/office/word/2016/wordml/cid" xmlns:w16="http://schemas.microsoft.com/office/word/2018/wordml" xmlns:w16sdtdh="http://schemas.microsoft.com/office/word/2020/wordml/sdtdatahash" xmlns:w16sdtfl="http://schemas.microsoft.com/office/word/2024/wordml/sdtformatlock" xmlns:w16se="http://schemas.microsoft.com/office/word/2015/wordml/symex" xmlns:w16du="http://schemas.microsoft.com/office/word/2023/wordml/word16du" xmlns:wne="http://schemas.microsoft.com/office/word/2006/wordml" mc:Ignorable="w14 w15 w16se w16cid w16 w16cex w16sdtdh w16sdtfl w16du wp14">
   <w:endnote w:type="separator" w:id="-1">
     <w:p>
       <w:pPr>
@@ -4852,7 +4857,7 @@
 </file>
 
 <file path=word/footer1.xml><?xml version="1.0" encoding="utf-8"?>
-<w:ftr xmlns:wpc="http://schemas.microsoft.com/office/word/2010/wordprocessingCanvas" xmlns:cx="http://schemas.microsoft.com/office/drawing/2014/chartex" xmlns:cx1="http://schemas.microsoft.com/office/drawing/2015/9/8/chartex" xmlns:cx2="http://schemas.microsoft.com/office/drawing/2015/10/21/chartex" xmlns:cx3="http://schemas.microsoft.com/office/drawing/2016/5/9/chartex" xmlns:cx4="http://schemas.microsoft.com/office/drawing/2016/5/10/chartex" xmlns:cx5="http://schemas.microsoft.com/office/drawing/2016/5/11/chartex" xmlns:cx6="http://schemas.microsoft.com/office/drawing/2016/5/12/chartex" xmlns:cx7="http://schemas.microsoft.com/office/drawing/2016/5/13/chartex" xmlns:cx8="http://schemas.microsoft.com/office/drawing/2016/5/14/chartex" xmlns:mc="http://schemas.openxmlformats.org/markup-compatibility/2006" xmlns:aink="http://schemas.microsoft.com/office/drawing/2016/ink" xmlns:am3d="http://schemas.microsoft.com/office/drawing/2017/model3d" xmlns:o="urn:schemas-microsoft-com:office:office" xmlns:oel="http://schemas.microsoft.com/office/2019/extlst" xmlns:r="http://schemas.openxmlformats.org/officeDocument/2006/relationships" xmlns:m="http://schemas.openxmlformats.org/officeDocument/2006/math" xmlns:v="urn:schemas-microsoft-com:vml" xmlns:wp14="http://schemas.microsoft.com/office/word/2010/wordprocessingDrawing" xmlns:wp="http://schemas.openxmlformats.org/drawingml/2006/wordprocessingDrawing" xmlns:w10="urn:schemas-microsoft-com:office:word" xmlns:w="http://schemas.openxmlformats.org/wordprocessingml/2006/main" xmlns:w14="http://schemas.microsoft.com/office/word/2010/wordml" xmlns:w15="http://schemas.microsoft.com/office/word/2012/wordml" xmlns:w16cex="http://schemas.microsoft.com/office/word/2018/wordml/cex" xmlns:w16cid="http://schemas.microsoft.com/office/word/2016/wordml/cid" xmlns:w16="http://schemas.microsoft.com/office/word/2018/wordml" xmlns:w16du="http://schemas.microsoft.com/office/word/2023/wordml/word16du" xmlns:w16sdtdh="http://schemas.microsoft.com/office/word/2020/wordml/sdtdatahash" xmlns:w16sdtfl="http://schemas.microsoft.com/office/word/2024/wordml/sdtformatlock" xmlns:w16se="http://schemas.microsoft.com/office/word/2015/wordml/symex" xmlns:wpg="http://schemas.microsoft.com/office/word/2010/wordprocessingGroup" xmlns:wpi="http://schemas.microsoft.com/office/word/2010/wordprocessingInk" xmlns:wne="http://schemas.microsoft.com/office/word/2006/wordml" xmlns:wps="http://schemas.microsoft.com/office/word/2010/wordprocessingShape" mc:Ignorable="w14 w15 w16se w16cid w16 w16cex w16sdtdh w16sdtfl w16du wp14">
+<w:ftr xmlns:wpc="http://schemas.microsoft.com/office/word/2010/wordprocessingCanvas" xmlns:cx="http://schemas.microsoft.com/office/drawing/2014/chartex" xmlns:cx1="http://schemas.microsoft.com/office/drawing/2015/9/8/chartex" xmlns:cx2="http://schemas.microsoft.com/office/drawing/2015/10/21/chartex" xmlns:cx3="http://schemas.microsoft.com/office/drawing/2016/5/9/chartex" xmlns:cx4="http://schemas.microsoft.com/office/drawing/2016/5/10/chartex" xmlns:cx5="http://schemas.microsoft.com/office/drawing/2016/5/11/chartex" xmlns:cx6="http://schemas.microsoft.com/office/drawing/2016/5/12/chartex" xmlns:cx7="http://schemas.microsoft.com/office/drawing/2016/5/13/chartex" xmlns:cx8="http://schemas.microsoft.com/office/drawing/2016/5/14/chartex" xmlns:mc="http://schemas.openxmlformats.org/markup-compatibility/2006" xmlns:m="http://schemas.openxmlformats.org/officeDocument/2006/math" xmlns:aink="http://schemas.microsoft.com/office/drawing/2016/ink" xmlns:am3d="http://schemas.microsoft.com/office/drawing/2017/model3d" xmlns:oel="http://schemas.microsoft.com/office/2019/extlst" xmlns:r="http://schemas.openxmlformats.org/officeDocument/2006/relationships" xmlns:wp14="http://schemas.microsoft.com/office/word/2010/wordprocessingDrawing" xmlns:wp="http://schemas.openxmlformats.org/drawingml/2006/wordprocessingDrawing" xmlns:wpg="http://schemas.microsoft.com/office/word/2010/wordprocessingGroup" xmlns:wpi="http://schemas.microsoft.com/office/word/2010/wordprocessingInk" xmlns:wps="http://schemas.microsoft.com/office/word/2010/wordprocessingShape" xmlns:o="urn:schemas-microsoft-com:office:office" xmlns:v="urn:schemas-microsoft-com:vml" xmlns:w10="urn:schemas-microsoft-com:office:word" xmlns:w="http://schemas.openxmlformats.org/wordprocessingml/2006/main" xmlns:w14="http://schemas.microsoft.com/office/word/2010/wordml" xmlns:w15="http://schemas.microsoft.com/office/word/2012/wordml" xmlns:w16cei="http://schemas.microsoft.com/office/word/2026/wordml/cei" xmlns:w16cex="http://schemas.microsoft.com/office/word/2018/wordml/cex" xmlns:w16cid="http://schemas.microsoft.com/office/word/2016/wordml/cid" xmlns:w16="http://schemas.microsoft.com/office/word/2018/wordml" xmlns:w16sdtdh="http://schemas.microsoft.com/office/word/2020/wordml/sdtdatahash" xmlns:w16sdtfl="http://schemas.microsoft.com/office/word/2024/wordml/sdtformatlock" xmlns:w16se="http://schemas.microsoft.com/office/word/2015/wordml/symex" xmlns:w16du="http://schemas.microsoft.com/office/word/2023/wordml/word16du" xmlns:wne="http://schemas.microsoft.com/office/word/2006/wordml" mc:Ignorable="w14 w15 w16se w16cid w16 w16cex w16sdtdh w16sdtfl w16du wp14">
   <w:p>
     <w:pPr>
       <w:pStyle w:val="Footer"/>
@@ -4902,7 +4907,7 @@
 </file>
 
 <file path=word/footnotes.xml><?xml version="1.0" encoding="utf-8"?>
-<w:footnotes xmlns:wpc="http://schemas.microsoft.com/office/word/2010/wordprocessingCanvas" xmlns:cx="http://schemas.microsoft.com/office/drawing/2014/chartex" xmlns:cx1="http://schemas.microsoft.com/office/drawing/2015/9/8/chartex" xmlns:cx2="http://schemas.microsoft.com/office/drawing/2015/10/21/chartex" xmlns:cx3="http://schemas.microsoft.com/office/drawing/2016/5/9/chartex" xmlns:cx4="http://schemas.microsoft.com/office/drawing/2016/5/10/chartex" xmlns:cx5="http://schemas.microsoft.com/office/drawing/2016/5/11/chartex" xmlns:cx6="http://schemas.microsoft.com/office/drawing/2016/5/12/chartex" xmlns:cx7="http://schemas.microsoft.com/office/drawing/2016/5/13/chartex" xmlns:cx8="http://schemas.microsoft.com/office/drawing/2016/5/14/chartex" xmlns:mc="http://schemas.openxmlformats.org/markup-compatibility/2006" xmlns:aink="http://schemas.microsoft.com/office/drawing/2016/ink" xmlns:am3d="http://schemas.microsoft.com/office/drawing/2017/model3d" xmlns:o="urn:schemas-microsoft-com:office:office" xmlns:oel="http://schemas.microsoft.com/office/2019/extlst" xmlns:r="http://schemas.openxmlformats.org/officeDocument/2006/relationships" xmlns:m="http://schemas.openxmlformats.org/officeDocument/2006/math" xmlns:v="urn:schemas-microsoft-com:vml" xmlns:wp14="http://schemas.microsoft.com/office/word/2010/wordprocessingDrawing" xmlns:wp="http://schemas.openxmlformats.org/drawingml/2006/wordprocessingDrawing" xmlns:w10="urn:schemas-microsoft-com:office:word" xmlns:w="http://schemas.openxmlformats.org/wordprocessingml/2006/main" xmlns:w14="http://schemas.microsoft.com/office/word/2010/wordml" xmlns:w15="http://schemas.microsoft.com/office/word/2012/wordml" xmlns:w16cex="http://schemas.microsoft.com/office/word/2018/wordml/cex" xmlns:w16cid="http://schemas.microsoft.com/office/word/2016/wordml/cid" xmlns:w16="http://schemas.microsoft.com/office/word/2018/wordml" xmlns:w16du="http://schemas.microsoft.com/office/word/2023/wordml/word16du" xmlns:w16sdtdh="http://schemas.microsoft.com/office/word/2020/wordml/sdtdatahash" xmlns:w16sdtfl="http://schemas.microsoft.com/office/word/2024/wordml/sdtformatlock" xmlns:w16se="http://schemas.microsoft.com/office/word/2015/wordml/symex" xmlns:wpg="http://schemas.microsoft.com/office/word/2010/wordprocessingGroup" xmlns:wpi="http://schemas.microsoft.com/office/word/2010/wordprocessingInk" xmlns:wne="http://schemas.microsoft.com/office/word/2006/wordml" xmlns:wps="http://schemas.microsoft.com/office/word/2010/wordprocessingShape" mc:Ignorable="w14 w15 w16se w16cid w16 w16cex w16sdtdh w16sdtfl w16du wp14">
+<w:footnotes xmlns:wpc="http://schemas.microsoft.com/office/word/2010/wordprocessingCanvas" xmlns:cx="http://schemas.microsoft.com/office/drawing/2014/chartex" xmlns:cx1="http://schemas.microsoft.com/office/drawing/2015/9/8/chartex" xmlns:cx2="http://schemas.microsoft.com/office/drawing/2015/10/21/chartex" xmlns:cx3="http://schemas.microsoft.com/office/drawing/2016/5/9/chartex" xmlns:cx4="http://schemas.microsoft.com/office/drawing/2016/5/10/chartex" xmlns:cx5="http://schemas.microsoft.com/office/drawing/2016/5/11/chartex" xmlns:cx6="http://schemas.microsoft.com/office/drawing/2016/5/12/chartex" xmlns:cx7="http://schemas.microsoft.com/office/drawing/2016/5/13/chartex" xmlns:cx8="http://schemas.microsoft.com/office/drawing/2016/5/14/chartex" xmlns:mc="http://schemas.openxmlformats.org/markup-compatibility/2006" xmlns:m="http://schemas.openxmlformats.org/officeDocument/2006/math" xmlns:aink="http://schemas.microsoft.com/office/drawing/2016/ink" xmlns:am3d="http://schemas.microsoft.com/office/drawing/2017/model3d" xmlns:oel="http://schemas.microsoft.com/office/2019/extlst" xmlns:r="http://schemas.openxmlformats.org/officeDocument/2006/relationships" xmlns:wp14="http://schemas.microsoft.com/office/word/2010/wordprocessingDrawing" xmlns:wp="http://schemas.openxmlformats.org/drawingml/2006/wordprocessingDrawing" xmlns:wpg="http://schemas.microsoft.com/office/word/2010/wordprocessingGroup" xmlns:wpi="http://schemas.microsoft.com/office/word/2010/wordprocessingInk" xmlns:wps="http://schemas.microsoft.com/office/word/2010/wordprocessingShape" xmlns:o="urn:schemas-microsoft-com:office:office" xmlns:v="urn:schemas-microsoft-com:vml" xmlns:w10="urn:schemas-microsoft-com:office:word" xmlns:w="http://schemas.openxmlformats.org/wordprocessingml/2006/main" xmlns:w14="http://schemas.microsoft.com/office/word/2010/wordml" xmlns:w15="http://schemas.microsoft.com/office/word/2012/wordml" xmlns:w16cei="http://schemas.microsoft.com/office/word/2026/wordml/cei" xmlns:w16cex="http://schemas.microsoft.com/office/word/2018/wordml/cex" xmlns:w16cid="http://schemas.microsoft.com/office/word/2016/wordml/cid" xmlns:w16="http://schemas.microsoft.com/office/word/2018/wordml" xmlns:w16sdtdh="http://schemas.microsoft.com/office/word/2020/wordml/sdtdatahash" xmlns:w16sdtfl="http://schemas.microsoft.com/office/word/2024/wordml/sdtformatlock" xmlns:w16se="http://schemas.microsoft.com/office/word/2015/wordml/symex" xmlns:w16du="http://schemas.microsoft.com/office/word/2023/wordml/word16du" xmlns:wne="http://schemas.microsoft.com/office/word/2006/wordml" mc:Ignorable="w14 w15 w16se w16cid w16 w16cex w16sdtdh w16sdtfl w16du wp14">
   <w:footnote w:type="separator" w:id="-1">
     <w:p>
       <w:pPr>
@@ -4927,7 +4932,7 @@
 </file>
 
 <file path=word/numbering.xml><?xml version="1.0" encoding="utf-8"?>
-<w:numbering xmlns:wpc="http://schemas.microsoft.com/office/word/2010/wordprocessingCanvas" xmlns:cx="http://schemas.microsoft.com/office/drawing/2014/chartex" xmlns:cx1="http://schemas.microsoft.com/office/drawing/2015/9/8/chartex" xmlns:cx2="http://schemas.microsoft.com/office/drawing/2015/10/21/chartex" xmlns:cx3="http://schemas.microsoft.com/office/drawing/2016/5/9/chartex" xmlns:cx4="http://schemas.microsoft.com/office/drawing/2016/5/10/chartex" xmlns:cx5="http://schemas.microsoft.com/office/drawing/2016/5/11/chartex" xmlns:cx6="http://schemas.microsoft.com/office/drawing/2016/5/12/chartex" xmlns:cx7="http://schemas.microsoft.com/office/drawing/2016/5/13/chartex" xmlns:cx8="http://schemas.microsoft.com/office/drawing/2016/5/14/chartex" xmlns:mc="http://schemas.openxmlformats.org/markup-compatibility/2006" xmlns:aink="http://schemas.microsoft.com/office/drawing/2016/ink" xmlns:am3d="http://schemas.microsoft.com/office/drawing/2017/model3d" xmlns:o="urn:schemas-microsoft-com:office:office" xmlns:oel="http://schemas.microsoft.com/office/2019/extlst" xmlns:r="http://schemas.openxmlformats.org/officeDocument/2006/relationships" xmlns:m="http://schemas.openxmlformats.org/officeDocument/2006/math" xmlns:v="urn:schemas-microsoft-com:vml" xmlns:wp14="http://schemas.microsoft.com/office/word/2010/wordprocessingDrawing" xmlns:wp="http://schemas.openxmlformats.org/drawingml/2006/wordprocessingDrawing" xmlns:w10="urn:schemas-microsoft-com:office:word" xmlns:w="http://schemas.openxmlformats.org/wordprocessingml/2006/main" xmlns:w14="http://schemas.microsoft.com/office/word/2010/wordml" xmlns:w15="http://schemas.microsoft.com/office/word/2012/wordml" xmlns:w16cex="http://schemas.microsoft.com/office/word/2018/wordml/cex" xmlns:w16cid="http://schemas.microsoft.com/office/word/2016/wordml/cid" xmlns:w16="http://schemas.microsoft.com/office/word/2018/wordml" xmlns:w16du="http://schemas.microsoft.com/office/word/2023/wordml/word16du" xmlns:w16sdtdh="http://schemas.microsoft.com/office/word/2020/wordml/sdtdatahash" xmlns:w16sdtfl="http://schemas.microsoft.com/office/word/2024/wordml/sdtformatlock" xmlns:w16se="http://schemas.microsoft.com/office/word/2015/wordml/symex" xmlns:wpg="http://schemas.microsoft.com/office/word/2010/wordprocessingGroup" xmlns:wpi="http://schemas.microsoft.com/office/word/2010/wordprocessingInk" xmlns:wne="http://schemas.microsoft.com/office/word/2006/wordml" xmlns:wps="http://schemas.microsoft.com/office/word/2010/wordprocessingShape" mc:Ignorable="w14 w15 w16se w16cid w16 w16cex w16sdtdh w16sdtfl w16du wp14">
+<w:numbering xmlns:wpc="http://schemas.microsoft.com/office/word/2010/wordprocessingCanvas" xmlns:cx="http://schemas.microsoft.com/office/drawing/2014/chartex" xmlns:cx1="http://schemas.microsoft.com/office/drawing/2015/9/8/chartex" xmlns:cx2="http://schemas.microsoft.com/office/drawing/2015/10/21/chartex" xmlns:cx3="http://schemas.microsoft.com/office/drawing/2016/5/9/chartex" xmlns:cx4="http://schemas.microsoft.com/office/drawing/2016/5/10/chartex" xmlns:cx5="http://schemas.microsoft.com/office/drawing/2016/5/11/chartex" xmlns:cx6="http://schemas.microsoft.com/office/drawing/2016/5/12/chartex" xmlns:cx7="http://schemas.microsoft.com/office/drawing/2016/5/13/chartex" xmlns:cx8="http://schemas.microsoft.com/office/drawing/2016/5/14/chartex" xmlns:mc="http://schemas.openxmlformats.org/markup-compatibility/2006" xmlns:m="http://schemas.openxmlformats.org/officeDocument/2006/math" xmlns:aink="http://schemas.microsoft.com/office/drawing/2016/ink" xmlns:am3d="http://schemas.microsoft.com/office/drawing/2017/model3d" xmlns:oel="http://schemas.microsoft.com/office/2019/extlst" xmlns:r="http://schemas.openxmlformats.org/officeDocument/2006/relationships" xmlns:wp14="http://schemas.microsoft.com/office/word/2010/wordprocessingDrawing" xmlns:wp="http://schemas.openxmlformats.org/drawingml/2006/wordprocessingDrawing" xmlns:wpg="http://schemas.microsoft.com/office/word/2010/wordprocessingGroup" xmlns:wpi="http://schemas.microsoft.com/office/word/2010/wordprocessingInk" xmlns:wps="http://schemas.microsoft.com/office/word/2010/wordprocessingShape" xmlns:o="urn:schemas-microsoft-com:office:office" xmlns:v="urn:schemas-microsoft-com:vml" xmlns:w10="urn:schemas-microsoft-com:office:word" xmlns:w="http://schemas.openxmlformats.org/wordprocessingml/2006/main" xmlns:w14="http://schemas.microsoft.com/office/word/2010/wordml" xmlns:w15="http://schemas.microsoft.com/office/word/2012/wordml" xmlns:w16cei="http://schemas.microsoft.com/office/word/2026/wordml/cei" xmlns:w16cex="http://schemas.microsoft.com/office/word/2018/wordml/cex" xmlns:w16cid="http://schemas.microsoft.com/office/word/2016/wordml/cid" xmlns:w16="http://schemas.microsoft.com/office/word/2018/wordml" xmlns:w16sdtdh="http://schemas.microsoft.com/office/word/2020/wordml/sdtdatahash" xmlns:w16sdtfl="http://schemas.microsoft.com/office/word/2024/wordml/sdtformatlock" xmlns:w16se="http://schemas.microsoft.com/office/word/2015/wordml/symex" xmlns:w16du="http://schemas.microsoft.com/office/word/2023/wordml/word16du" xmlns:wne="http://schemas.microsoft.com/office/word/2006/wordml" mc:Ignorable="w14 w15 w16se w16cid w16 w16cex w16sdtdh w16sdtfl w16du wp14">
   <w:abstractNum w:abstractNumId="0" w15:restartNumberingAfterBreak="0">
     <w:nsid w:val="108E54CC"/>
     <w:multiLevelType w:val="hybridMultilevel"/>
@@ -6208,7 +6213,7 @@
 </file>
 
 <file path=word/styles.xml><?xml version="1.0" encoding="utf-8"?>
-<w:styles xmlns:mc="http://schemas.openxmlformats.org/markup-compatibility/2006" xmlns:r="http://schemas.openxmlformats.org/officeDocument/2006/relationships" xmlns:w="http://schemas.openxmlformats.org/wordprocessingml/2006/main" xmlns:w14="http://schemas.microsoft.com/office/word/2010/wordml" xmlns:w15="http://schemas.microsoft.com/office/word/2012/wordml" xmlns:w16cex="http://schemas.microsoft.com/office/word/2018/wordml/cex" xmlns:w16cid="http://schemas.microsoft.com/office/word/2016/wordml/cid" xmlns:w16="http://schemas.microsoft.com/office/word/2018/wordml" xmlns:w16du="http://schemas.microsoft.com/office/word/2023/wordml/word16du" xmlns:w16sdtdh="http://schemas.microsoft.com/office/word/2020/wordml/sdtdatahash" xmlns:w16sdtfl="http://schemas.microsoft.com/office/word/2024/wordml/sdtformatlock" xmlns:w16se="http://schemas.microsoft.com/office/word/2015/wordml/symex" mc:Ignorable="w14 w15 w16se w16cid w16 w16cex w16sdtdh w16sdtfl w16du">
+<w:styles xmlns:mc="http://schemas.openxmlformats.org/markup-compatibility/2006" xmlns:r="http://schemas.openxmlformats.org/officeDocument/2006/relationships" xmlns:w="http://schemas.openxmlformats.org/wordprocessingml/2006/main" xmlns:w14="http://schemas.microsoft.com/office/word/2010/wordml" xmlns:w15="http://schemas.microsoft.com/office/word/2012/wordml" xmlns:w16cex="http://schemas.microsoft.com/office/word/2018/wordml/cex" xmlns:w16cid="http://schemas.microsoft.com/office/word/2016/wordml/cid" xmlns:w16="http://schemas.microsoft.com/office/word/2018/wordml" xmlns:w16sdtdh="http://schemas.microsoft.com/office/word/2020/wordml/sdtdatahash" xmlns:w16sdtfl="http://schemas.microsoft.com/office/word/2024/wordml/sdtformatlock" xmlns:w16se="http://schemas.microsoft.com/office/word/2015/wordml/symex" xmlns:w16du="http://schemas.microsoft.com/office/word/2023/wordml/word16du" mc:Ignorable="w14 w15 w16se w16cid w16 w16cex w16sdtdh w16sdtfl w16du">
   <w:docDefaults>
     <w:rPrDefault>
       <w:rPr>

</xml_diff>